<commit_message>
feat: Enhance resume adaptation and export functionality
- Updated resume adaptation logic to include structured fields such as name, title, roles, solutions, industries, technologies, key engagements, education, certifications, and experience.
- Introduced a new template for DOCX export that aligns with Perficient corporate standards.
- Implemented error handling for missing adaptation results and template files during export.
- Added validation schemas for adaptation results and export responses.
- Improved command-line settings for testing various Node.js and TypeScript commands.
- Created a new script for preparing the DOCX template with dynamic content.
</commit_message>
<xml_diff>
--- a/templates/perficient-resume.docx
+++ b/templates/perficient-resume.docx
@@ -2,158 +2,33 @@
 <file path=word/document.xml><?xml version="1.0" encoding="utf-8"?>
 <w:document xmlns:wpc="http://schemas.microsoft.com/office/word/2010/wordprocessingCanvas" xmlns:cx="http://schemas.microsoft.com/office/drawing/2014/chartex" xmlns:cx1="http://schemas.microsoft.com/office/drawing/2015/9/8/chartex" xmlns:cx2="http://schemas.microsoft.com/office/drawing/2015/10/21/chartex" xmlns:cx3="http://schemas.microsoft.com/office/drawing/2016/5/9/chartex" xmlns:cx4="http://schemas.microsoft.com/office/drawing/2016/5/10/chartex" xmlns:cx5="http://schemas.microsoft.com/office/drawing/2016/5/11/chartex" xmlns:cx6="http://schemas.microsoft.com/office/drawing/2016/5/12/chartex" xmlns:cx7="http://schemas.microsoft.com/office/drawing/2016/5/13/chartex" xmlns:cx8="http://schemas.microsoft.com/office/drawing/2016/5/14/chartex" xmlns:mc="http://schemas.openxmlformats.org/markup-compatibility/2006" xmlns:aink="http://schemas.microsoft.com/office/drawing/2016/ink" xmlns:am3d="http://schemas.microsoft.com/office/drawing/2017/model3d" xmlns:o="urn:schemas-microsoft-com:office:office" xmlns:oel="http://schemas.microsoft.com/office/2019/extlst" xmlns:r="http://schemas.openxmlformats.org/officeDocument/2006/relationships" xmlns:m="http://schemas.openxmlformats.org/officeDocument/2006/math" xmlns:v="urn:schemas-microsoft-com:vml" xmlns:wp14="http://schemas.microsoft.com/office/word/2010/wordprocessingDrawing" xmlns:wp="http://schemas.openxmlformats.org/drawingml/2006/wordprocessingDrawing" xmlns:w10="urn:schemas-microsoft-com:office:word" xmlns:w="http://schemas.openxmlformats.org/wordprocessingml/2006/main" xmlns:w14="http://schemas.microsoft.com/office/word/2010/wordml" xmlns:w15="http://schemas.microsoft.com/office/word/2012/wordml" xmlns:w16cex="http://schemas.microsoft.com/office/word/2018/wordml/cex" xmlns:w16cid="http://schemas.microsoft.com/office/word/2016/wordml/cid" xmlns:w16="http://schemas.microsoft.com/office/word/2018/wordml" xmlns:w16du="http://schemas.microsoft.com/office/word/2023/wordml/word16du" xmlns:w16sdtdh="http://schemas.microsoft.com/office/word/2020/wordml/sdtdatahash" xmlns:w16sdtfl="http://schemas.microsoft.com/office/word/2024/wordml/sdtformatlock" xmlns:w16se="http://schemas.microsoft.com/office/word/2015/wordml/symex" xmlns:wpg="http://schemas.microsoft.com/office/word/2010/wordprocessingGroup" xmlns:wpi="http://schemas.microsoft.com/office/word/2010/wordprocessingInk" xmlns:wne="http://schemas.microsoft.com/office/word/2006/wordml" xmlns:wps="http://schemas.microsoft.com/office/word/2010/wordprocessingShape" mc:Ignorable="w14 w15 w16se w16cid w16 w16cex w16sdtdh w16sdtfl w16du wp14">
   <w:body>
-    <w:bookmarkStart w:id="0" w:name="_Toc1569881"/>
-    <w:bookmarkStart w:id="1" w:name="_Toc85736129"/>
-    <w:bookmarkStart w:id="2" w:name="_Toc153805886"/>
-    <w:bookmarkStart w:id="3" w:name="_Toc167805953"/>
-    <w:bookmarkStart w:id="4" w:name="_Toc167870433"/>
-    <w:bookmarkStart w:id="5" w:name="_Toc185520180"/>
     <w:p>
+      <w:pPr>
+        <w:pStyle w:val="Heading1"/>
+      </w:pPr>
+      <w:r>
+        <w:t>{firstName} {lastName}</w:t>
+      </w:r>
+    </w:p>
+    <w:p>
+      <w:pPr>
+        <w:pStyle w:val="BodyText"/>
+        <w:jc w:val="right"/>
+        <w:rPr>
+          <w:rFonts w:ascii="Aptos" w:hAnsi="Aptos"/>
+          <w:sz w:val="24"/>
+          <w:szCs w:val="24"/>
+        </w:rPr>
+      </w:pPr>
       <w:r>
         <w:rPr>
-          <w:noProof/>
+          <w:rFonts w:ascii="Aptos" w:hAnsi="Aptos"/>
+          <w:sz w:val="24"/>
+          <w:szCs w:val="24"/>
         </w:rPr>
-        <mc:AlternateContent>
-          <mc:Choice Requires="wps">
-            <w:drawing>
-              <wp:anchor distT="0" distB="0" distL="114300" distR="114300" simplePos="0" relativeHeight="251659264" behindDoc="0" locked="0" layoutInCell="1" allowOverlap="1" wp14:anchorId="029CA602" wp14:editId="3761FB08">
-                <wp:simplePos x="0" y="0"/>
-                <wp:positionH relativeFrom="margin">
-                  <wp:align>right</wp:align>
-                </wp:positionH>
-                <wp:positionV relativeFrom="page">
-                  <wp:posOffset>360680</wp:posOffset>
-                </wp:positionV>
-                <wp:extent cx="2888615" cy="810260"/>
-                <wp:effectExtent l="0" t="0" r="6985" b="8890"/>
-                <wp:wrapNone/>
-                <wp:docPr id="1126115285" name="Text Box 14"/>
-                <wp:cNvGraphicFramePr/>
-                <a:graphic xmlns:a="http://schemas.openxmlformats.org/drawingml/2006/main">
-                  <a:graphicData uri="http://schemas.microsoft.com/office/word/2010/wordprocessingShape">
-                    <wps:wsp>
-                      <wps:cNvSpPr txBox="1"/>
-                      <wps:spPr>
-                        <a:xfrm>
-                          <a:off x="0" y="0"/>
-                          <a:ext cx="2888615" cy="810260"/>
-                        </a:xfrm>
-                        <a:prstGeom prst="rect">
-                          <a:avLst/>
-                        </a:prstGeom>
-                        <a:solidFill>
-                          <a:schemeClr val="lt1"/>
-                        </a:solidFill>
-                        <a:ln w="6350">
-                          <a:noFill/>
-                        </a:ln>
-                      </wps:spPr>
-                      <wps:txbx>
-                        <w:txbxContent>
-                          <w:p>
-                            <w:pPr>
-                              <w:pStyle w:val="Heading1"/>
-                            </w:pPr>
-                            <w:r>
-                              <w:t>FIRST</w:t>
-                            </w:r>
-                            <w:r>
-                              <w:t xml:space="preserve"> </w:t>
-                            </w:r>
-                            <w:r>
-                              <w:t>LAST NAME</w:t>
-                            </w:r>
-                          </w:p>
-                          <w:p>
-                            <w:pPr>
-                              <w:pStyle w:val="BodyText"/>
-                              <w:jc w:val="right"/>
-                              <w:rPr>
-                                <w:rFonts w:ascii="Aptos" w:hAnsi="Aptos"/>
-                                <w:sz w:val="24"/>
-                                <w:szCs w:val="24"/>
-                              </w:rPr>
-                            </w:pPr>
-                            <w:r>
-                              <w:rPr>
-                                <w:rFonts w:ascii="Aptos" w:hAnsi="Aptos"/>
-                                <w:sz w:val="24"/>
-                                <w:szCs w:val="24"/>
-                              </w:rPr>
-                              <w:t>Sr. Project Manager</w:t>
-                            </w:r>
-                          </w:p>
-                        </w:txbxContent>
-                      </wps:txbx>
-                      <wps:bodyPr rot="0" spcFirstLastPara="0" vertOverflow="overflow" horzOverflow="overflow" vert="horz" wrap="square" lIns="91440" tIns="45720" rIns="91440" bIns="45720" numCol="1" spcCol="0" rtlCol="0" fromWordArt="0" anchor="t" anchorCtr="0" forceAA="0" compatLnSpc="1">
-                        <a:prstTxWarp prst="textNoShape">
-                          <a:avLst/>
-                        </a:prstTxWarp>
-                        <a:noAutofit/>
-                      </wps:bodyPr>
-                    </wps:wsp>
-                  </a:graphicData>
-                </a:graphic>
-              </wp:anchor>
-            </w:drawing>
-          </mc:Choice>
-          <mc:Fallback>
-            <w:pict>
-              <v:shapetype w14:anchorId="029CA602" id="_x0000_t202" coordsize="21600,21600" o:spt="202" path="m,l,21600r21600,l21600,xe">
-                <v:stroke joinstyle="miter"/>
-                <v:path gradientshapeok="t" o:connecttype="rect"/>
-              </v:shapetype>
-              <v:shape id="Text Box 14" o:spid="_x0000_s1026" type="#_x0000_t202" style="position:absolute;margin-left:176.25pt;margin-top:28.4pt;width:227.45pt;height:63.8pt;z-index:251659264;visibility:visible;mso-wrap-style:square;mso-wrap-distance-left:9pt;mso-wrap-distance-top:0;mso-wrap-distance-right:9pt;mso-wrap-distance-bottom:0;mso-position-horizontal:right;mso-position-horizontal-relative:margin;mso-position-vertical:absolute;mso-position-vertical-relative:page;v-text-anchor:top" o:gfxdata="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" fillcolor="white [3201]" stroked="f" strokeweight=".5pt">
-                <v:textbox>
-                  <w:txbxContent>
-                    <w:p>
-                      <w:pPr>
-                        <w:pStyle w:val="Heading1"/>
-                      </w:pPr>
-                      <w:r>
-                        <w:t>FIRST</w:t>
-                      </w:r>
-                      <w:r>
-                        <w:t xml:space="preserve"> </w:t>
-                      </w:r>
-                      <w:r>
-                        <w:t>LAST NAME</w:t>
-                      </w:r>
-                    </w:p>
-                    <w:p>
-                      <w:pPr>
-                        <w:pStyle w:val="BodyText"/>
-                        <w:jc w:val="right"/>
-                        <w:rPr>
-                          <w:rFonts w:ascii="Aptos" w:hAnsi="Aptos"/>
-                          <w:sz w:val="24"/>
-                          <w:szCs w:val="24"/>
-                        </w:rPr>
-                      </w:pPr>
-                      <w:r>
-                        <w:rPr>
-                          <w:rFonts w:ascii="Aptos" w:hAnsi="Aptos"/>
-                          <w:sz w:val="24"/>
-                          <w:szCs w:val="24"/>
-                        </w:rPr>
-                        <w:t>Sr. Project Manager</w:t>
-                      </w:r>
-                    </w:p>
-                  </w:txbxContent>
-                </v:textbox>
-                <w10:wrap anchorx="margin" anchory="page"/>
-              </v:shape>
-            </w:pict>
-          </mc:Fallback>
-        </mc:AlternateContent>
+        <w:t>{title}</w:t>
       </w:r>
     </w:p>
-    <w:bookmarkEnd w:id="0"/>
-    <w:bookmarkEnd w:id="1"/>
-    <w:bookmarkEnd w:id="2"/>
-    <w:bookmarkEnd w:id="3"/>
-    <w:bookmarkEnd w:id="4"/>
-    <w:bookmarkEnd w:id="5"/>
     <w:p/>
     <w:p>
       <w:pPr>
@@ -174,31 +49,21 @@
         <w:pStyle w:val="09BodyCopy"/>
       </w:pPr>
       <w:r>
-        <w:t xml:space="preserve">I am putting more sentences here to really get the point across.  Make it seem like a good bio.  This consultant is very good and is an expert.  For &lt;total years of experience&gt;, &lt;Ms./Mr.&gt;&lt;Consultant Last Name&gt; has &lt;Led </w:t>
-      </w:r>
-      <w:r>
-        <w:t>or participated</w:t>
-      </w:r>
-      <w:r>
-        <w:t>&gt; on teams doing analysis, design, development, implementations, enhancements and testing of applications in these areas: (you can add 1 at MOST 2 sentences to this area).</w:t>
+        <w:t>{professionalOverview}</w:t>
       </w:r>
     </w:p>
-    <w:p>
-      <w:pPr>
-        <w:pStyle w:val="09BodyCopy"/>
-      </w:pPr>
-    </w:p>
+    <w:p/>
     <w:tbl>
       <w:tblPr>
         <w:tblW w:w="10260" w:type="dxa"/>
         <w:tblInd w:w="108" w:type="dxa"/>
         <w:tblBorders>
-          <w:top w:val="single" w:sz="4" w:space="0" w:color="F2F2F2" w:themeColor="background1" w:themeShade="F2"/>
-          <w:left w:val="single" w:sz="4" w:space="0" w:color="F2F2F2" w:themeColor="background1" w:themeShade="F2"/>
-          <w:bottom w:val="single" w:sz="4" w:space="0" w:color="F2F2F2" w:themeColor="background1" w:themeShade="F2"/>
-          <w:right w:val="single" w:sz="4" w:space="0" w:color="F2F2F2" w:themeColor="background1" w:themeShade="F2"/>
-          <w:insideH w:val="single" w:sz="4" w:space="0" w:color="F2F2F2" w:themeColor="background1" w:themeShade="F2"/>
-          <w:insideV w:val="single" w:sz="4" w:space="0" w:color="F2F2F2" w:themeColor="background1" w:themeShade="F2"/>
+          <w:top w:val="single" w:sz="4" w:space="0" w:color="F2F2F2"/>
+          <w:left w:val="single" w:sz="4" w:space="0" w:color="F2F2F2"/>
+          <w:bottom w:val="single" w:sz="4" w:space="0" w:color="F2F2F2"/>
+          <w:right w:val="single" w:sz="4" w:space="0" w:color="F2F2F2"/>
+          <w:insideH w:val="single" w:sz="4" w:space="0" w:color="F2F2F2"/>
+          <w:insideV w:val="single" w:sz="4" w:space="0" w:color="F2F2F2"/>
         </w:tblBorders>
         <w:tblLook w:val="01E0" w:firstRow="1" w:lastRow="1" w:firstColumn="1" w:lastColumn="1" w:noHBand="0" w:noVBand="0"/>
       </w:tblPr>
@@ -235,11 +100,8 @@
             <w:vAlign w:val="center"/>
           </w:tcPr>
           <w:p>
-            <w:pPr>
-              <w:pStyle w:val="ListParagraph"/>
-            </w:pPr>
             <w:r>
-              <w:t>Project Manager</w:t>
+              <w:t>{#roles}</w:t>
             </w:r>
           </w:p>
           <w:p>
@@ -247,15 +109,12 @@
               <w:pStyle w:val="ListParagraph"/>
             </w:pPr>
             <w:r>
-              <w:t>Program Manager</w:t>
+              <w:t>{.}</w:t>
             </w:r>
           </w:p>
           <w:p>
-            <w:pPr>
-              <w:pStyle w:val="ListParagraph"/>
-            </w:pPr>
             <w:r>
-              <w:t>Offshore Management</w:t>
+              <w:t>{/roles}</w:t>
             </w:r>
           </w:p>
         </w:tc>
@@ -272,11 +131,6 @@
           <w:p>
             <w:pPr>
               <w:pStyle w:val="09BodyCopy"/>
-              <w:rPr>
-                <w:color w:val="000000"/>
-                <w:sz w:val="18"/>
-                <w:szCs w:val="18"/>
-              </w:rPr>
             </w:pPr>
             <w:r>
               <w:rPr>
@@ -293,11 +147,8 @@
             <w:vAlign w:val="center"/>
           </w:tcPr>
           <w:p>
-            <w:pPr>
-              <w:pStyle w:val="ListParagraph"/>
-            </w:pPr>
             <w:r>
-              <w:t>Product Lifecycle Management (PLM)</w:t>
+              <w:t>{#solutions}</w:t>
             </w:r>
           </w:p>
           <w:p>
@@ -305,23 +156,12 @@
               <w:pStyle w:val="ListParagraph"/>
             </w:pPr>
             <w:r>
-              <w:t>Enterprise Application Integration (EAI)</w:t>
+              <w:t>{.}</w:t>
             </w:r>
           </w:p>
           <w:p>
-            <w:pPr>
-              <w:pStyle w:val="ListParagraph"/>
-            </w:pPr>
             <w:r>
-              <w:t>Business Process Management (BPM)</w:t>
-            </w:r>
-          </w:p>
-          <w:p>
-            <w:pPr>
-              <w:pStyle w:val="ListParagraph"/>
-            </w:pPr>
-            <w:r>
-              <w:t>Custom Web applications</w:t>
+              <w:t>{/solutions}</w:t>
             </w:r>
           </w:p>
         </w:tc>
@@ -338,11 +178,6 @@
           <w:p>
             <w:pPr>
               <w:pStyle w:val="09BodyCopy"/>
-              <w:rPr>
-                <w:color w:val="000000"/>
-                <w:sz w:val="18"/>
-                <w:szCs w:val="18"/>
-              </w:rPr>
             </w:pPr>
             <w:r>
               <w:rPr>
@@ -359,11 +194,8 @@
             <w:vAlign w:val="center"/>
           </w:tcPr>
           <w:p>
-            <w:pPr>
-              <w:pStyle w:val="ListParagraph"/>
-            </w:pPr>
             <w:r>
-              <w:t>Finance</w:t>
+              <w:t>{#industries}</w:t>
             </w:r>
           </w:p>
           <w:p>
@@ -371,23 +203,12 @@
               <w:pStyle w:val="ListParagraph"/>
             </w:pPr>
             <w:r>
-              <w:t>Telecom</w:t>
+              <w:t>{.}</w:t>
             </w:r>
           </w:p>
           <w:p>
-            <w:pPr>
-              <w:pStyle w:val="ListParagraph"/>
-            </w:pPr>
             <w:r>
-              <w:t>High-tech</w:t>
-            </w:r>
-          </w:p>
-          <w:p>
-            <w:pPr>
-              <w:pStyle w:val="ListParagraph"/>
-            </w:pPr>
-            <w:r>
-              <w:t>Food &amp; beverage</w:t>
+              <w:t>{/industries}</w:t>
             </w:r>
           </w:p>
         </w:tc>
@@ -404,11 +225,6 @@
           <w:p>
             <w:pPr>
               <w:pStyle w:val="09BodyCopy"/>
-              <w:rPr>
-                <w:color w:val="000000"/>
-                <w:sz w:val="18"/>
-                <w:szCs w:val="18"/>
-              </w:rPr>
             </w:pPr>
             <w:r>
               <w:rPr>
@@ -425,11 +241,8 @@
             <w:vAlign w:val="center"/>
           </w:tcPr>
           <w:p>
-            <w:pPr>
-              <w:pStyle w:val="ListParagraph"/>
-            </w:pPr>
             <w:r>
-              <w:t>Integration: TIBCO, WebSphere BPM Suite</w:t>
+              <w:t>{#technologies}</w:t>
             </w:r>
           </w:p>
           <w:p>
@@ -437,25 +250,18 @@
               <w:pStyle w:val="ListParagraph"/>
             </w:pPr>
             <w:r>
-              <w:t>Java/JEE platforms</w:t>
+              <w:t>{.}</w:t>
             </w:r>
           </w:p>
           <w:p>
-            <w:pPr>
-              <w:pStyle w:val="ListParagraph"/>
-            </w:pPr>
             <w:r>
-              <w:t>SAP R/3 – FI/CO financials</w:t>
+              <w:t>{/technologies}</w:t>
             </w:r>
           </w:p>
         </w:tc>
       </w:tr>
     </w:tbl>
-    <w:p>
-      <w:pPr>
-        <w:pStyle w:val="08Heading6"/>
-      </w:pPr>
-    </w:p>
+    <w:p/>
     <w:p>
       <w:pPr>
         <w:pStyle w:val="08Heading6"/>
@@ -469,12 +275,12 @@
         <w:tblW w:w="10260" w:type="dxa"/>
         <w:tblInd w:w="108" w:type="dxa"/>
         <w:tblBorders>
-          <w:top w:val="single" w:sz="4" w:space="0" w:color="F2F2F2" w:themeColor="background1" w:themeShade="F2"/>
-          <w:left w:val="single" w:sz="4" w:space="0" w:color="F2F2F2" w:themeColor="background1" w:themeShade="F2"/>
-          <w:bottom w:val="single" w:sz="4" w:space="0" w:color="F2F2F2" w:themeColor="background1" w:themeShade="F2"/>
-          <w:right w:val="single" w:sz="4" w:space="0" w:color="F2F2F2" w:themeColor="background1" w:themeShade="F2"/>
-          <w:insideH w:val="single" w:sz="4" w:space="0" w:color="F2F2F2" w:themeColor="background1" w:themeShade="F2"/>
-          <w:insideV w:val="single" w:sz="4" w:space="0" w:color="F2F2F2" w:themeColor="background1" w:themeShade="F2"/>
+          <w:top w:val="single" w:sz="4" w:space="0" w:color="F2F2F2"/>
+          <w:left w:val="single" w:sz="4" w:space="0" w:color="F2F2F2"/>
+          <w:bottom w:val="single" w:sz="4" w:space="0" w:color="F2F2F2"/>
+          <w:right w:val="single" w:sz="4" w:space="0" w:color="F2F2F2"/>
+          <w:insideH w:val="single" w:sz="4" w:space="0" w:color="F2F2F2"/>
+          <w:insideV w:val="single" w:sz="4" w:space="0" w:color="F2F2F2"/>
         </w:tblBorders>
         <w:tblLook w:val="0000" w:firstRow="0" w:lastRow="0" w:firstColumn="0" w:lastColumn="0" w:noHBand="0" w:noVBand="0"/>
       </w:tblPr>
@@ -484,9 +290,6 @@
         <w:gridCol w:w="5873"/>
       </w:tblGrid>
       <w:tr>
-        <w:trPr>
-          <w:cantSplit/>
-        </w:trPr>
         <w:tc>
           <w:tcPr>
             <w:tcW w:w="2587" w:type="dxa"/>
@@ -496,7 +299,7 @@
               <w:pStyle w:val="09BodyCopy"/>
             </w:pPr>
             <w:r>
-              <w:t>Large Consumer Products Manufacturing Company</w:t>
+              <w:t>{#keyEngagements}{company}</w:t>
             </w:r>
           </w:p>
         </w:tc>
@@ -509,7 +312,7 @@
               <w:pStyle w:val="09BodyCopy"/>
             </w:pPr>
             <w:r>
-              <w:t xml:space="preserve">Program Manager </w:t>
+              <w:t>{role}</w:t>
             </w:r>
           </w:p>
         </w:tc>
@@ -522,106 +325,13 @@
               <w:pStyle w:val="09BodyCopy"/>
             </w:pPr>
             <w:r>
-              <w:t>Managed overall program for a large integration and BPM system.  Coordinated the work of multiple teams.</w:t>
-            </w:r>
-          </w:p>
-        </w:tc>
-      </w:tr>
-      <w:tr>
-        <w:trPr>
-          <w:cantSplit/>
-        </w:trPr>
-        <w:tc>
-          <w:tcPr>
-            <w:tcW w:w="2587" w:type="dxa"/>
-          </w:tcPr>
-          <w:p>
-            <w:pPr>
-              <w:pStyle w:val="09BodyCopy"/>
-            </w:pPr>
-            <w:r>
-              <w:t>Worldwide Agricultural Company</w:t>
-            </w:r>
-          </w:p>
-        </w:tc>
-        <w:tc>
-          <w:tcPr>
-            <w:tcW w:w="1800" w:type="dxa"/>
-          </w:tcPr>
-          <w:p>
-            <w:pPr>
-              <w:pStyle w:val="09BodyCopy"/>
-            </w:pPr>
-            <w:r>
-              <w:t>Project Manager</w:t>
-            </w:r>
-          </w:p>
-        </w:tc>
-        <w:tc>
-          <w:tcPr>
-            <w:tcW w:w="5873" w:type="dxa"/>
-          </w:tcPr>
-          <w:p>
-            <w:pPr>
-              <w:pStyle w:val="09BodyCopy"/>
-            </w:pPr>
-            <w:r>
-              <w:t>Project manager for TIBCO integration project.  Managed development team of local and offshore resources.</w:t>
-            </w:r>
-          </w:p>
-        </w:tc>
-      </w:tr>
-      <w:tr>
-        <w:trPr>
-          <w:cantSplit/>
-        </w:trPr>
-        <w:tc>
-          <w:tcPr>
-            <w:tcW w:w="2587" w:type="dxa"/>
-          </w:tcPr>
-          <w:p>
-            <w:pPr>
-              <w:pStyle w:val="09BodyCopy"/>
-            </w:pPr>
-            <w:r>
-              <w:t>Large Federal Agency</w:t>
-            </w:r>
-          </w:p>
-        </w:tc>
-        <w:tc>
-          <w:tcPr>
-            <w:tcW w:w="1800" w:type="dxa"/>
-          </w:tcPr>
-          <w:p>
-            <w:pPr>
-              <w:pStyle w:val="09BodyCopy"/>
-            </w:pPr>
-            <w:r>
-              <w:t>Project Manager</w:t>
-            </w:r>
-          </w:p>
-        </w:tc>
-        <w:tc>
-          <w:tcPr>
-            <w:tcW w:w="5873" w:type="dxa"/>
-          </w:tcPr>
-          <w:p>
-            <w:pPr>
-              <w:pStyle w:val="09BodyCopy"/>
-            </w:pPr>
-            <w:r>
-              <w:t>Project manager for a large custom Web application project.  Managed development team of Perficient and client resources.</w:t>
+              <w:t>{description}{/keyEngagements}</w:t>
             </w:r>
           </w:p>
         </w:tc>
       </w:tr>
     </w:tbl>
-    <w:p>
-      <w:pPr>
-        <w:pStyle w:val="08Heading6"/>
-        <w:ind w:left="0"/>
-      </w:pPr>
-    </w:p>
+    <w:p/>
     <w:tbl>
       <w:tblPr>
         <w:tblW w:w="10267" w:type="dxa"/>
@@ -662,6 +372,11 @@
             </w:r>
           </w:p>
           <w:p>
+            <w:r>
+              <w:t>{#education}</w:t>
+            </w:r>
+          </w:p>
+          <w:p>
             <w:pPr>
               <w:rPr>
                 <w:rFonts w:ascii="Aptos" w:hAnsi="Aptos"/>
@@ -675,19 +390,12 @@
                 <w:sz w:val="20"/>
                 <w:szCs w:val="20"/>
               </w:rPr>
-              <w:t>MBA, Texas Christian University 1994</w:t>
+              <w:t>{degree}, {institution} {year}</w:t>
             </w:r>
           </w:p>
           <w:p>
-            <w:pPr>
-              <w:pStyle w:val="09BodyCopy"/>
-              <w:rPr>
-                <w:b/>
-                <w:bCs/>
-              </w:rPr>
-            </w:pPr>
             <w:r>
-              <w:t>Bachelor of Science, University of Alabama 1987</w:t>
+              <w:t>{/education}</w:t>
             </w:r>
           </w:p>
         </w:tc>
@@ -712,6 +420,11 @@
             </w:r>
           </w:p>
           <w:p>
+            <w:r>
+              <w:t>{#certifications}</w:t>
+            </w:r>
+          </w:p>
+          <w:p>
             <w:pPr>
               <w:rPr>
                 <w:rFonts w:ascii="Aptos" w:hAnsi="Aptos"/>
@@ -725,423 +438,52 @@
                 <w:sz w:val="20"/>
                 <w:szCs w:val="20"/>
               </w:rPr>
-              <w:t>Project Management Professional (PMP) certified</w:t>
+              <w:t>{.}</w:t>
             </w:r>
           </w:p>
           <w:p>
-            <w:pPr>
-              <w:pStyle w:val="09BodyCopy"/>
-              <w:spacing w:afterLines="0" w:after="0"/>
-              <w:contextualSpacing w:val="0"/>
-              <w:rPr>
-                <w:b/>
-                <w:bCs/>
-              </w:rPr>
-            </w:pPr>
             <w:r>
-              <w:t>OCUP Certification (UML Certified)</w:t>
-            </w:r>
-          </w:p>
-        </w:tc>
-      </w:tr>
-      <w:tr>
-        <w:trPr>
-          <w:trHeight w:val="248"/>
-        </w:trPr>
-        <w:tc>
-          <w:tcPr>
-            <w:tcW w:w="5227" w:type="dxa"/>
-          </w:tcPr>
-          <w:p>
-            <w:pPr>
-              <w:rPr>
-                <w:sz w:val="18"/>
-                <w:szCs w:val="18"/>
-              </w:rPr>
-            </w:pPr>
-          </w:p>
-        </w:tc>
-        <w:tc>
-          <w:tcPr>
-            <w:tcW w:w="5040" w:type="dxa"/>
-          </w:tcPr>
-          <w:p>
-            <w:pPr>
-              <w:rPr>
-                <w:sz w:val="18"/>
-                <w:szCs w:val="18"/>
-              </w:rPr>
-            </w:pPr>
-          </w:p>
-        </w:tc>
-      </w:tr>
-      <w:tr>
-        <w:trPr>
-          <w:trHeight w:val="54"/>
-        </w:trPr>
-        <w:tc>
-          <w:tcPr>
-            <w:tcW w:w="5227" w:type="dxa"/>
-            <w:vAlign w:val="center"/>
-          </w:tcPr>
-          <w:p>
-            <w:pPr>
-              <w:pStyle w:val="09BodyCopy"/>
-              <w:rPr>
-                <w:b/>
-                <w:bCs/>
-                <w:i/>
-              </w:rPr>
-            </w:pPr>
-            <w:r>
-              <w:rPr>
-                <w:b/>
-                <w:bCs/>
-              </w:rPr>
-              <w:t>Publications</w:t>
-            </w:r>
-          </w:p>
-        </w:tc>
-        <w:tc>
-          <w:tcPr>
-            <w:tcW w:w="5040" w:type="dxa"/>
-            <w:vAlign w:val="center"/>
-          </w:tcPr>
-          <w:p>
-            <w:pPr>
-              <w:pStyle w:val="09BodyCopy"/>
-              <w:spacing w:afterLines="0" w:after="0"/>
-              <w:contextualSpacing w:val="0"/>
-              <w:rPr>
-                <w:b/>
-                <w:bCs/>
-              </w:rPr>
-            </w:pPr>
-            <w:r>
-              <w:rPr>
-                <w:b/>
-                <w:bCs/>
-              </w:rPr>
-              <w:t>Geographic locale</w:t>
-            </w:r>
-          </w:p>
-        </w:tc>
-      </w:tr>
-      <w:tr>
-        <w:trPr>
-          <w:trHeight w:val="706"/>
-        </w:trPr>
-        <w:tc>
-          <w:tcPr>
-            <w:tcW w:w="5227" w:type="dxa"/>
-          </w:tcPr>
-          <w:p>
-            <w:pPr>
-              <w:pStyle w:val="ListParagraph"/>
-            </w:pPr>
-            <w:r>
-              <w:t>Whitepaper, Publication, Year</w:t>
-            </w:r>
-          </w:p>
-          <w:p>
-            <w:pPr>
-              <w:pStyle w:val="ListParagraph"/>
-            </w:pPr>
-            <w:r>
-              <w:t>Whitepaper, Publication, Year</w:t>
-            </w:r>
-          </w:p>
-        </w:tc>
-        <w:tc>
-          <w:tcPr>
-            <w:tcW w:w="5040" w:type="dxa"/>
-          </w:tcPr>
-          <w:p>
-            <w:pPr>
-              <w:pStyle w:val="ListParagraph"/>
-            </w:pPr>
-            <w:r>
-              <w:t>Houston, Texas</w:t>
-            </w:r>
-          </w:p>
-          <w:p>
-            <w:pPr>
-              <w:pStyle w:val="ListParagraph"/>
-            </w:pPr>
-            <w:r>
-              <w:t>100% Travel Available</w:t>
+              <w:t>{/certifications}</w:t>
             </w:r>
           </w:p>
         </w:tc>
       </w:tr>
     </w:tbl>
+    <w:p/>
     <w:p>
       <w:pPr>
         <w:pStyle w:val="08Heading6"/>
-        <w:tabs>
-          <w:tab w:val="left" w:pos="1880"/>
-        </w:tabs>
-        <w:ind w:left="0"/>
       </w:pPr>
       <w:r>
-        <w:rPr>
-          <w:noProof/>
-        </w:rPr>
-        <w:lastRenderedPageBreak/>
-        <mc:AlternateContent>
-          <mc:Choice Requires="wps">
-            <w:drawing>
-              <wp:anchor distT="0" distB="0" distL="114300" distR="114300" simplePos="0" relativeHeight="251661312" behindDoc="0" locked="0" layoutInCell="1" allowOverlap="1" wp14:anchorId="1853134C" wp14:editId="709ADFA0">
-                <wp:simplePos x="0" y="0"/>
-                <wp:positionH relativeFrom="margin">
-                  <wp:posOffset>2528108</wp:posOffset>
-                </wp:positionH>
-                <wp:positionV relativeFrom="page">
-                  <wp:posOffset>422275</wp:posOffset>
-                </wp:positionV>
-                <wp:extent cx="4273608" cy="408709"/>
-                <wp:effectExtent l="0" t="0" r="0" b="0"/>
-                <wp:wrapNone/>
-                <wp:docPr id="715511671" name="Text Box 14"/>
-                <wp:cNvGraphicFramePr/>
-                <a:graphic xmlns:a="http://schemas.openxmlformats.org/drawingml/2006/main">
-                  <a:graphicData uri="http://schemas.microsoft.com/office/word/2010/wordprocessingShape">
-                    <wps:wsp>
-                      <wps:cNvSpPr txBox="1"/>
-                      <wps:spPr>
-                        <a:xfrm>
-                          <a:off x="0" y="0"/>
-                          <a:ext cx="4273608" cy="408709"/>
-                        </a:xfrm>
-                        <a:prstGeom prst="rect">
-                          <a:avLst/>
-                        </a:prstGeom>
-                        <a:noFill/>
-                        <a:ln w="6350">
-                          <a:noFill/>
-                        </a:ln>
-                      </wps:spPr>
-                      <wps:txbx>
-                        <w:txbxContent>
-                          <w:p>
-                            <w:pPr>
-                              <w:pStyle w:val="Heading1"/>
-                            </w:pPr>
-                            <w:r>
-                              <w:t>PROFESSIONAL AND BUSINESS EXPERIENCE</w:t>
-                            </w:r>
-                          </w:p>
-                        </w:txbxContent>
-                      </wps:txbx>
-                      <wps:bodyPr rot="0" spcFirstLastPara="0" vertOverflow="overflow" horzOverflow="overflow" vert="horz" wrap="square" lIns="91440" tIns="45720" rIns="91440" bIns="45720" numCol="1" spcCol="0" rtlCol="0" fromWordArt="0" anchor="t" anchorCtr="0" forceAA="0" compatLnSpc="1">
-                        <a:prstTxWarp prst="textNoShape">
-                          <a:avLst/>
-                        </a:prstTxWarp>
-                        <a:noAutofit/>
-                      </wps:bodyPr>
-                    </wps:wsp>
-                  </a:graphicData>
-                </a:graphic>
-                <wp14:sizeRelH relativeFrom="margin">
-                  <wp14:pctWidth>0</wp14:pctWidth>
-                </wp14:sizeRelH>
-                <wp14:sizeRelV relativeFrom="margin">
-                  <wp14:pctHeight>0</wp14:pctHeight>
-                </wp14:sizeRelV>
-              </wp:anchor>
-            </w:drawing>
-          </mc:Choice>
-          <mc:Fallback>
-            <w:pict>
-              <v:shape w14:anchorId="1853134C" id="_x0000_s1027" type="#_x0000_t202" style="position:absolute;margin-left:199.05pt;margin-top:33.25pt;width:336.5pt;height:32.2pt;z-index:251661312;visibility:visible;mso-wrap-style:square;mso-width-percent:0;mso-height-percent:0;mso-wrap-distance-left:9pt;mso-wrap-distance-top:0;mso-wrap-distance-right:9pt;mso-wrap-distance-bottom:0;mso-position-horizontal:absolute;mso-position-horizontal-relative:margin;mso-position-vertical:absolute;mso-position-vertical-relative:page;mso-width-percent:0;mso-height-percent:0;mso-width-relative:margin;mso-height-relative:margin;v-text-anchor:top" o:gfxdata="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" filled="f" stroked="f" strokeweight=".5pt">
-                <v:textbox>
-                  <w:txbxContent>
-                    <w:p>
-                      <w:pPr>
-                        <w:pStyle w:val="Heading1"/>
-                      </w:pPr>
-                      <w:r>
-                        <w:t>PROFESSIONAL AND BUSINESS EXPERIENCE</w:t>
-                      </w:r>
-                    </w:p>
-                  </w:txbxContent>
-                </v:textbox>
-                <w10:wrap anchorx="margin" anchory="page"/>
-              </v:shape>
-            </w:pict>
-          </mc:Fallback>
-        </mc:AlternateContent>
-      </w:r>
-      <w:r>
-        <w:tab/>
+        <w:t>PROFESSIONAL AND BUSINESS EXPERIENCE</w:t>
       </w:r>
     </w:p>
     <w:p>
       <w:pPr>
-        <w:pStyle w:val="08Heading6"/>
-        <w:ind w:left="0"/>
-      </w:pPr>
-    </w:p>
-    <w:p>
-      <w:pPr>
         <w:pStyle w:val="07Heading5"/>
-        <w:spacing w:afterLines="0" w:after="0"/>
-        <w:ind w:left="0"/>
-        <w:contextualSpacing w:val="0"/>
-      </w:pPr>
-      <w:r>
-        <w:rPr>
-          <w:noProof/>
-        </w:rPr>
-        <mc:AlternateContent>
-          <mc:Choice Requires="wps">
-            <w:drawing>
-              <wp:anchor distT="0" distB="0" distL="114300" distR="114300" simplePos="0" relativeHeight="251663360" behindDoc="0" locked="0" layoutInCell="1" allowOverlap="1" wp14:anchorId="1908948C" wp14:editId="04C979D6">
-                <wp:simplePos x="0" y="0"/>
-                <wp:positionH relativeFrom="margin">
-                  <wp:posOffset>4038600</wp:posOffset>
-                </wp:positionH>
-                <wp:positionV relativeFrom="page">
-                  <wp:posOffset>1177636</wp:posOffset>
-                </wp:positionV>
-                <wp:extent cx="2618220" cy="408305"/>
-                <wp:effectExtent l="0" t="0" r="0" b="0"/>
-                <wp:wrapNone/>
-                <wp:docPr id="1909256453" name="Text Box 14"/>
-                <wp:cNvGraphicFramePr/>
-                <a:graphic xmlns:a="http://schemas.openxmlformats.org/drawingml/2006/main">
-                  <a:graphicData uri="http://schemas.microsoft.com/office/word/2010/wordprocessingShape">
-                    <wps:wsp>
-                      <wps:cNvSpPr txBox="1"/>
-                      <wps:spPr>
-                        <a:xfrm>
-                          <a:off x="0" y="0"/>
-                          <a:ext cx="2618220" cy="408305"/>
-                        </a:xfrm>
-                        <a:prstGeom prst="rect">
-                          <a:avLst/>
-                        </a:prstGeom>
-                        <a:noFill/>
-                        <a:ln w="6350">
-                          <a:noFill/>
-                        </a:ln>
-                      </wps:spPr>
-                      <wps:txbx>
-                        <w:txbxContent>
-                          <w:p>
-                            <w:pPr>
-                              <w:pStyle w:val="Heading1"/>
-                              <w:rPr>
-                                <w:sz w:val="28"/>
-                                <w:szCs w:val="28"/>
-                              </w:rPr>
-                            </w:pPr>
-                            <w:r>
-                              <w:rPr>
-                                <w:sz w:val="28"/>
-                                <w:szCs w:val="28"/>
-                              </w:rPr>
-                              <w:t>START DATE – PRESENT</w:t>
-                            </w:r>
-                          </w:p>
-                        </w:txbxContent>
-                      </wps:txbx>
-                      <wps:bodyPr rot="0" spcFirstLastPara="0" vertOverflow="overflow" horzOverflow="overflow" vert="horz" wrap="square" lIns="91440" tIns="45720" rIns="91440" bIns="45720" numCol="1" spcCol="0" rtlCol="0" fromWordArt="0" anchor="t" anchorCtr="0" forceAA="0" compatLnSpc="1">
-                        <a:prstTxWarp prst="textNoShape">
-                          <a:avLst/>
-                        </a:prstTxWarp>
-                        <a:noAutofit/>
-                      </wps:bodyPr>
-                    </wps:wsp>
-                  </a:graphicData>
-                </a:graphic>
-                <wp14:sizeRelH relativeFrom="margin">
-                  <wp14:pctWidth>0</wp14:pctWidth>
-                </wp14:sizeRelH>
-                <wp14:sizeRelV relativeFrom="margin">
-                  <wp14:pctHeight>0</wp14:pctHeight>
-                </wp14:sizeRelV>
-              </wp:anchor>
-            </w:drawing>
-          </mc:Choice>
-          <mc:Fallback>
-            <w:pict>
-              <v:shape w14:anchorId="1908948C" id="_x0000_s1028" type="#_x0000_t202" style="position:absolute;margin-left:318pt;margin-top:92.75pt;width:206.15pt;height:32.15pt;z-index:251663360;visibility:visible;mso-wrap-style:square;mso-width-percent:0;mso-height-percent:0;mso-wrap-distance-left:9pt;mso-wrap-distance-top:0;mso-wrap-distance-right:9pt;mso-wrap-distance-bottom:0;mso-position-horizontal:absolute;mso-position-horizontal-relative:margin;mso-position-vertical:absolute;mso-position-vertical-relative:page;mso-width-percent:0;mso-height-percent:0;mso-width-relative:margin;mso-height-relative:margin;v-text-anchor:top" o:gfxdata="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" filled="f" stroked="f" strokeweight=".5pt">
-                <v:textbox>
-                  <w:txbxContent>
-                    <w:p>
-                      <w:pPr>
-                        <w:pStyle w:val="Heading1"/>
-                        <w:rPr>
-                          <w:sz w:val="28"/>
-                          <w:szCs w:val="28"/>
-                        </w:rPr>
-                      </w:pPr>
-                      <w:r>
-                        <w:rPr>
-                          <w:sz w:val="28"/>
-                          <w:szCs w:val="28"/>
-                        </w:rPr>
-                        <w:t>START DATE – PRESENT</w:t>
-                      </w:r>
-                    </w:p>
-                  </w:txbxContent>
-                </v:textbox>
-                <w10:wrap anchorx="margin" anchory="page"/>
-              </v:shape>
-            </w:pict>
-          </mc:Fallback>
-        </mc:AlternateContent>
-      </w:r>
+      </w:pPr>
       <w:r>
         <w:t>PERFICIENT, INC.</w:t>
-      </w:r>
-      <w:r>
-        <w:tab/>
-      </w:r>
-      <w:r>
-        <w:tab/>
-      </w:r>
-      <w:r>
-        <w:tab/>
-      </w:r>
-      <w:r>
-        <w:tab/>
-      </w:r>
-      <w:r>
-        <w:tab/>
-        <w:t xml:space="preserve">          </w:t>
-      </w:r>
-      <w:r>
-        <w:tab/>
-      </w:r>
-      <w:r>
-        <w:tab/>
-        <w:t xml:space="preserve">         </w:t>
-      </w:r>
-      <w:r>
-        <w:tab/>
-        <w:t xml:space="preserve">     </w:t>
-      </w:r>
-      <w:r>
-        <w:tab/>
-        <w:t xml:space="preserve">   </w:t>
-      </w:r>
-    </w:p>
-    <w:p>
-      <w:pPr>
-        <w:pStyle w:val="Title"/>
-      </w:pPr>
-      <w:r>
-        <w:t>Sr. Project Manager</w:t>
       </w:r>
     </w:p>
     <w:p/>
     <w:p>
+      <w:r>
+        <w:t>{#experience}</w:t>
+      </w:r>
+    </w:p>
+    <w:p>
+      <w:pPr>
+        <w:pStyle w:val="Title"/>
+      </w:pPr>
+      <w:r>
+        <w:t>{role}</w:t>
+      </w:r>
+    </w:p>
+    <w:p>
       <w:pPr>
         <w:rPr>
           <w:rFonts w:ascii="Aptos" w:hAnsi="Aptos"/>
-          <w:i/>
         </w:rPr>
       </w:pPr>
       <w:r>
@@ -1150,38 +492,15 @@
           <w:b/>
           <w:bCs/>
         </w:rPr>
-        <w:t>CLIENT:</w:t>
+        <w:t xml:space="preserve">CLIENT: </w:t>
       </w:r>
       <w:r>
         <w:rPr>
           <w:rFonts w:ascii="Aptos" w:hAnsi="Aptos"/>
         </w:rPr>
-        <w:t xml:space="preserve"> Large Consumer Products Manufacturing Company</w:t>
+        <w:t>{client}</w:t>
       </w:r>
     </w:p>
-    <w:p>
-      <w:pPr>
-        <w:pStyle w:val="09BodyCopy"/>
-      </w:pPr>
-      <w:r>
-        <w:t xml:space="preserve">Participated in (or </w:t>
-      </w:r>
-      <w:proofErr w:type="gramStart"/>
-      <w:r>
-        <w:t>Led</w:t>
-      </w:r>
-      <w:proofErr w:type="gramEnd"/>
-      <w:r>
-        <w:t xml:space="preserve">) a &lt;#&gt; person team doing &lt;analysis, design, development, implementation, enhancements and testing&gt; of a &lt;****1-2 sentence at most </w:t>
-      </w:r>
-      <w:r>
-        <w:t>talking</w:t>
-      </w:r>
-      <w:r>
-        <w:t xml:space="preserve"> about the project&gt; utilizing &lt;list only major technology that YOU personally worked on&gt;.</w:t>
-      </w:r>
-    </w:p>
-    <w:p/>
     <w:p>
       <w:pPr>
         <w:rPr>
@@ -1194,29 +513,44 @@
           <w:b/>
           <w:bCs/>
         </w:rPr>
-        <w:t>Responsibilitie</w:t>
+        <w:t xml:space="preserve">PERIOD: </w:t>
       </w:r>
+      <w:r>
+        <w:rPr>
+          <w:rFonts w:ascii="Aptos" w:hAnsi="Aptos"/>
+        </w:rPr>
+        <w:t>{period}</w:t>
+      </w:r>
+    </w:p>
+    <w:p>
+      <w:pPr>
+        <w:pStyle w:val="09BodyCopy"/>
+      </w:pPr>
+      <w:r>
+        <w:t>{projectDescription}</w:t>
+      </w:r>
+    </w:p>
+    <w:p/>
+    <w:p>
+      <w:pPr>
+        <w:rPr>
+          <w:rFonts w:ascii="Aptos" w:hAnsi="Aptos"/>
+          <w:b/>
+          <w:bCs/>
+        </w:rPr>
+      </w:pPr>
       <w:r>
         <w:rPr>
           <w:rFonts w:ascii="Aptos" w:hAnsi="Aptos"/>
           <w:b/>
           <w:bCs/>
         </w:rPr>
-        <w:t>s:</w:t>
-      </w:r>
-      <w:r>
-        <w:rPr>
-          <w:rFonts w:ascii="Aptos" w:hAnsi="Aptos"/>
-        </w:rPr>
-        <w:t xml:space="preserve"> *(here tell what YOU specifically did technically staring with most senior skills)</w:t>
+        <w:t>Responsibilities:</w:t>
       </w:r>
     </w:p>
     <w:p>
-      <w:pPr>
-        <w:pStyle w:val="ListParagraph"/>
-      </w:pPr>
       <w:r>
-        <w:t>Performed multithreaded programming. Threaded APIs, synchronization and thread specific data.</w:t>
+        <w:t>{#responsibilities}</w:t>
       </w:r>
     </w:p>
     <w:p>
@@ -1224,42 +558,12 @@
         <w:pStyle w:val="ListParagraph"/>
       </w:pPr>
       <w:r>
-        <w:t>Used ATL to create controls that….</w:t>
+        <w:t>{.}</w:t>
       </w:r>
     </w:p>
     <w:p>
-      <w:pPr>
-        <w:pStyle w:val="ListParagraph"/>
-      </w:pPr>
       <w:r>
-        <w:t>Created DLLs, custom drawn controls, dialogs, document/view to</w:t>
-      </w:r>
-      <w:proofErr w:type="gramStart"/>
-      <w:r>
-        <w:t>…..</w:t>
-      </w:r>
-      <w:proofErr w:type="gramEnd"/>
-    </w:p>
-    <w:p>
-      <w:pPr>
-        <w:pStyle w:val="ListParagraph"/>
-      </w:pPr>
-      <w:r>
-        <w:t>Integrated COM and ATL with MFC………</w:t>
-      </w:r>
-    </w:p>
-    <w:p>
-      <w:pPr>
-        <w:pStyle w:val="ListParagraph"/>
-      </w:pPr>
-      <w:r>
-        <w:t xml:space="preserve">Transformed numerous </w:t>
-      </w:r>
-      <w:r>
-        <w:t>ODs</w:t>
-      </w:r>
-      <w:r>
-        <w:t xml:space="preserve"> into a corresponding Class Diagram (CD)</w:t>
+        <w:t>{/responsibilities}</w:t>
       </w:r>
     </w:p>
     <w:p/>
@@ -1281,484 +585,32 @@
       </w:r>
     </w:p>
     <w:p>
-      <w:pPr>
-        <w:pStyle w:val="ListParagraph"/>
-      </w:pPr>
       <w:r>
-        <w:t>After implementation, company realized ROI of $</w:t>
-      </w:r>
-      <w:proofErr w:type="spellStart"/>
-      <w:proofErr w:type="gramStart"/>
-      <w:r>
-        <w:t>xxx.xx</w:t>
-      </w:r>
-      <w:proofErr w:type="spellEnd"/>
-      <w:proofErr w:type="gramEnd"/>
-    </w:p>
-    <w:p/>
-    <w:p/>
-    <w:p>
-      <w:pPr>
-        <w:rPr>
-          <w:rFonts w:ascii="Aptos" w:hAnsi="Aptos"/>
-          <w:i/>
-        </w:rPr>
-      </w:pPr>
-      <w:r>
-        <w:rPr>
-          <w:rFonts w:ascii="Aptos" w:hAnsi="Aptos"/>
-          <w:b/>
-          <w:bCs/>
-        </w:rPr>
-        <w:t>CLIENT:</w:t>
-      </w:r>
-      <w:r>
-        <w:rPr>
-          <w:rFonts w:ascii="Aptos" w:hAnsi="Aptos"/>
-        </w:rPr>
-        <w:t xml:space="preserve"> Large Consumer Products Manufacturing Company</w:t>
+        <w:t>{#businessValue}</w:t>
       </w:r>
     </w:p>
     <w:p>
       <w:pPr>
-        <w:pStyle w:val="09BodyCopy"/>
+        <w:pStyle w:val="ListParagraph"/>
       </w:pPr>
       <w:r>
-        <w:t xml:space="preserve">Participated in (or </w:t>
+        <w:t>{.}</w:t>
       </w:r>
-      <w:proofErr w:type="gramStart"/>
+    </w:p>
+    <w:p>
       <w:r>
-        <w:t>Led</w:t>
-      </w:r>
-      <w:proofErr w:type="gramEnd"/>
-      <w:r>
-        <w:t>) a &lt;#&gt; person team doing &lt;analysis, design, development, implementation, enhancements and testing&gt; of a &lt;****1-2 sentence at most talking about the project&gt; utilizing &lt;list only major technology that YOU personally worked on&gt;.</w:t>
+        <w:t>{/businessValue}</w:t>
       </w:r>
     </w:p>
     <w:p/>
     <w:p>
-      <w:pPr>
-        <w:rPr>
-          <w:rFonts w:ascii="Aptos" w:hAnsi="Aptos"/>
-        </w:rPr>
-      </w:pPr>
       <w:r>
-        <w:rPr>
-          <w:rFonts w:ascii="Aptos" w:hAnsi="Aptos"/>
-          <w:b/>
-          <w:bCs/>
-        </w:rPr>
-        <w:t>Responsibilities</w:t>
-      </w:r>
-      <w:r>
-        <w:rPr>
-          <w:rFonts w:ascii="Aptos" w:hAnsi="Aptos"/>
-          <w:b/>
-          <w:bCs/>
-        </w:rPr>
-        <w:t>:</w:t>
-      </w:r>
-      <w:r>
-        <w:rPr>
-          <w:rFonts w:ascii="Aptos" w:hAnsi="Aptos"/>
-        </w:rPr>
-        <w:t xml:space="preserve"> *(here tell what YOU specifically did technically staring with most senior skills)</w:t>
+        <w:t>{/experience}</w:t>
       </w:r>
     </w:p>
-    <w:p>
-      <w:pPr>
-        <w:pStyle w:val="ListParagraph"/>
-      </w:pPr>
-      <w:r>
-        <w:t>Performed multithreaded programming. Threaded APIs, synchronization and thread specific data.</w:t>
-      </w:r>
-    </w:p>
-    <w:p>
-      <w:pPr>
-        <w:pStyle w:val="ListParagraph"/>
-      </w:pPr>
-      <w:r>
-        <w:t>Used ATL to create controls that….</w:t>
-      </w:r>
-    </w:p>
-    <w:p>
-      <w:pPr>
-        <w:pStyle w:val="ListParagraph"/>
-      </w:pPr>
-      <w:r>
-        <w:t>Created DLLs, custom drawn controls, dialogs, document/view to</w:t>
-      </w:r>
-      <w:proofErr w:type="gramStart"/>
-      <w:r>
-        <w:t>…..</w:t>
-      </w:r>
-      <w:proofErr w:type="gramEnd"/>
-    </w:p>
-    <w:p>
-      <w:pPr>
-        <w:pStyle w:val="ListParagraph"/>
-      </w:pPr>
-      <w:r>
-        <w:t>Integrated COM and ATL with MFC………</w:t>
-      </w:r>
-    </w:p>
-    <w:p>
-      <w:pPr>
-        <w:pStyle w:val="ListParagraph"/>
-      </w:pPr>
-      <w:r>
-        <w:t>Transformed numerous ODs into a corresponding Class Diagram (CD)</w:t>
-      </w:r>
-    </w:p>
-    <w:p/>
-    <w:p>
-      <w:pPr>
-        <w:rPr>
-          <w:rFonts w:ascii="Aptos" w:hAnsi="Aptos"/>
-          <w:b/>
-          <w:bCs/>
-        </w:rPr>
-      </w:pPr>
-      <w:r>
-        <w:rPr>
-          <w:rFonts w:ascii="Aptos" w:hAnsi="Aptos"/>
-          <w:b/>
-          <w:bCs/>
-        </w:rPr>
-        <w:t>Business/Technology Value</w:t>
-      </w:r>
-    </w:p>
-    <w:p>
-      <w:pPr>
-        <w:pStyle w:val="ListParagraph"/>
-      </w:pPr>
-      <w:proofErr w:type="spellStart"/>
-      <w:r>
-        <w:t>xxxxxx</w:t>
-      </w:r>
-      <w:proofErr w:type="spellEnd"/>
-    </w:p>
-    <w:p>
-      <w:pPr>
-        <w:spacing w:afterLines="0" w:after="200" w:line="276" w:lineRule="auto"/>
-        <w:contextualSpacing w:val="0"/>
-      </w:pPr>
-      <w:r>
-        <w:br w:type="page"/>
-      </w:r>
-    </w:p>
-    <w:p>
-      <w:pPr>
-        <w:spacing w:afterLines="0" w:after="200" w:line="276" w:lineRule="auto"/>
-        <w:contextualSpacing w:val="0"/>
-      </w:pPr>
-    </w:p>
-    <w:p/>
-    <w:p>
-      <w:pPr>
-        <w:pStyle w:val="07Heading5"/>
-        <w:spacing w:afterLines="0" w:after="0"/>
-        <w:ind w:left="0"/>
-        <w:contextualSpacing w:val="0"/>
-      </w:pPr>
-      <w:r>
-        <w:rPr>
-          <w:noProof/>
-        </w:rPr>
-        <mc:AlternateContent>
-          <mc:Choice Requires="wps">
-            <w:drawing>
-              <wp:anchor distT="0" distB="0" distL="114300" distR="114300" simplePos="0" relativeHeight="251665408" behindDoc="0" locked="0" layoutInCell="1" allowOverlap="1" wp14:anchorId="29B1EA01" wp14:editId="296AE548">
-                <wp:simplePos x="0" y="0"/>
-                <wp:positionH relativeFrom="margin">
-                  <wp:posOffset>4038600</wp:posOffset>
-                </wp:positionH>
-                <wp:positionV relativeFrom="page">
-                  <wp:posOffset>1177636</wp:posOffset>
-                </wp:positionV>
-                <wp:extent cx="2618220" cy="408305"/>
-                <wp:effectExtent l="0" t="0" r="0" b="0"/>
-                <wp:wrapNone/>
-                <wp:docPr id="1949850311" name="Text Box 14"/>
-                <wp:cNvGraphicFramePr/>
-                <a:graphic xmlns:a="http://schemas.openxmlformats.org/drawingml/2006/main">
-                  <a:graphicData uri="http://schemas.microsoft.com/office/word/2010/wordprocessingShape">
-                    <wps:wsp>
-                      <wps:cNvSpPr txBox="1"/>
-                      <wps:spPr>
-                        <a:xfrm>
-                          <a:off x="0" y="0"/>
-                          <a:ext cx="2618220" cy="408305"/>
-                        </a:xfrm>
-                        <a:prstGeom prst="rect">
-                          <a:avLst/>
-                        </a:prstGeom>
-                        <a:noFill/>
-                        <a:ln w="6350">
-                          <a:noFill/>
-                        </a:ln>
-                      </wps:spPr>
-                      <wps:txbx>
-                        <w:txbxContent>
-                          <w:p>
-                            <w:pPr>
-                              <w:pStyle w:val="Heading1"/>
-                              <w:rPr>
-                                <w:sz w:val="28"/>
-                                <w:szCs w:val="28"/>
-                              </w:rPr>
-                            </w:pPr>
-                            <w:r>
-                              <w:rPr>
-                                <w:sz w:val="28"/>
-                                <w:szCs w:val="28"/>
-                              </w:rPr>
-                              <w:t>START DATE – PRESENT</w:t>
-                            </w:r>
-                          </w:p>
-                        </w:txbxContent>
-                      </wps:txbx>
-                      <wps:bodyPr rot="0" spcFirstLastPara="0" vertOverflow="overflow" horzOverflow="overflow" vert="horz" wrap="square" lIns="91440" tIns="45720" rIns="91440" bIns="45720" numCol="1" spcCol="0" rtlCol="0" fromWordArt="0" anchor="t" anchorCtr="0" forceAA="0" compatLnSpc="1">
-                        <a:prstTxWarp prst="textNoShape">
-                          <a:avLst/>
-                        </a:prstTxWarp>
-                        <a:noAutofit/>
-                      </wps:bodyPr>
-                    </wps:wsp>
-                  </a:graphicData>
-                </a:graphic>
-                <wp14:sizeRelH relativeFrom="margin">
-                  <wp14:pctWidth>0</wp14:pctWidth>
-                </wp14:sizeRelH>
-                <wp14:sizeRelV relativeFrom="margin">
-                  <wp14:pctHeight>0</wp14:pctHeight>
-                </wp14:sizeRelV>
-              </wp:anchor>
-            </w:drawing>
-          </mc:Choice>
-          <mc:Fallback>
-            <w:pict>
-              <v:shape w14:anchorId="29B1EA01" id="_x0000_s1029" type="#_x0000_t202" style="position:absolute;margin-left:318pt;margin-top:92.75pt;width:206.15pt;height:32.15pt;z-index:251665408;visibility:visible;mso-wrap-style:square;mso-width-percent:0;mso-height-percent:0;mso-wrap-distance-left:9pt;mso-wrap-distance-top:0;mso-wrap-distance-right:9pt;mso-wrap-distance-bottom:0;mso-position-horizontal:absolute;mso-position-horizontal-relative:margin;mso-position-vertical:absolute;mso-position-vertical-relative:page;mso-width-percent:0;mso-height-percent:0;mso-width-relative:margin;mso-height-relative:margin;v-text-anchor:top" o:gfxdata="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" filled="f" stroked="f" strokeweight=".5pt">
-                <v:textbox>
-                  <w:txbxContent>
-                    <w:p>
-                      <w:pPr>
-                        <w:pStyle w:val="Heading1"/>
-                        <w:rPr>
-                          <w:sz w:val="28"/>
-                          <w:szCs w:val="28"/>
-                        </w:rPr>
-                      </w:pPr>
-                      <w:r>
-                        <w:rPr>
-                          <w:sz w:val="28"/>
-                          <w:szCs w:val="28"/>
-                        </w:rPr>
-                        <w:t>START DATE – PRESENT</w:t>
-                      </w:r>
-                    </w:p>
-                  </w:txbxContent>
-                </v:textbox>
-                <w10:wrap anchorx="margin" anchory="page"/>
-              </v:shape>
-            </w:pict>
-          </mc:Fallback>
-        </mc:AlternateContent>
-      </w:r>
-      <w:r>
-        <w:t>[</w:t>
-      </w:r>
-      <w:r>
-        <w:t>NAME PREVIOUS EMPLOYER HERE</w:t>
-      </w:r>
-      <w:r>
-        <w:t>]</w:t>
-      </w:r>
-      <w:r>
-        <w:tab/>
-      </w:r>
-      <w:r>
-        <w:tab/>
-      </w:r>
-      <w:r>
-        <w:tab/>
-      </w:r>
-      <w:r>
-        <w:tab/>
-      </w:r>
-      <w:r>
-        <w:tab/>
-        <w:t xml:space="preserve">          </w:t>
-      </w:r>
-      <w:r>
-        <w:tab/>
-      </w:r>
-      <w:r>
-        <w:tab/>
-        <w:t xml:space="preserve">         </w:t>
-      </w:r>
-      <w:r>
-        <w:tab/>
-        <w:t xml:space="preserve">     </w:t>
-      </w:r>
-      <w:r>
-        <w:tab/>
-        <w:t xml:space="preserve">   </w:t>
-      </w:r>
-    </w:p>
-    <w:p>
-      <w:pPr>
-        <w:pStyle w:val="Title"/>
-      </w:pPr>
-      <w:r>
-        <w:t>Title/Position</w:t>
-      </w:r>
-    </w:p>
-    <w:p/>
-    <w:p>
-      <w:pPr>
-        <w:pStyle w:val="09BodyCopy"/>
-      </w:pPr>
-      <w:r>
-        <w:t xml:space="preserve">Participated in (or </w:t>
-      </w:r>
-      <w:proofErr w:type="gramStart"/>
-      <w:r>
-        <w:t>Led</w:t>
-      </w:r>
-      <w:proofErr w:type="gramEnd"/>
-      <w:r>
-        <w:t>) a &lt;#&gt; person team doing &lt;analysis, design, development, implementation, enhancements and testing&gt; of a &lt;****1-2 sentence at most talking about the project&gt; utilizing &lt;list only major technology that YOU personally worked on&gt;.</w:t>
-      </w:r>
-    </w:p>
-    <w:p/>
-    <w:p>
-      <w:pPr>
-        <w:rPr>
-          <w:rFonts w:ascii="Aptos" w:hAnsi="Aptos"/>
-        </w:rPr>
-      </w:pPr>
-      <w:r>
-        <w:rPr>
-          <w:rFonts w:ascii="Aptos" w:hAnsi="Aptos"/>
-          <w:b/>
-          <w:bCs/>
-        </w:rPr>
-        <w:t>Responsibilities</w:t>
-      </w:r>
-      <w:r>
-        <w:rPr>
-          <w:rFonts w:ascii="Aptos" w:hAnsi="Aptos"/>
-          <w:b/>
-          <w:bCs/>
-        </w:rPr>
-        <w:t>:</w:t>
-      </w:r>
-      <w:r>
-        <w:rPr>
-          <w:rFonts w:ascii="Aptos" w:hAnsi="Aptos"/>
-        </w:rPr>
-        <w:t xml:space="preserve"> *(here tell what YOU specifically did technically staring with most senior skills)</w:t>
-      </w:r>
-    </w:p>
-    <w:p>
-      <w:pPr>
-        <w:pStyle w:val="ListParagraph"/>
-      </w:pPr>
-      <w:r>
-        <w:t>Performed multithreaded programming. Threaded APIs, synchronization and thread specific data.</w:t>
-      </w:r>
-    </w:p>
-    <w:p>
-      <w:pPr>
-        <w:pStyle w:val="ListParagraph"/>
-      </w:pPr>
-      <w:r>
-        <w:t>Used ATL to create controls that….</w:t>
-      </w:r>
-    </w:p>
-    <w:p>
-      <w:pPr>
-        <w:pStyle w:val="ListParagraph"/>
-      </w:pPr>
-      <w:r>
-        <w:t>Created DLLs, custom drawn controls, dialogs, document/view to</w:t>
-      </w:r>
-      <w:proofErr w:type="gramStart"/>
-      <w:r>
-        <w:t>…..</w:t>
-      </w:r>
-      <w:proofErr w:type="gramEnd"/>
-    </w:p>
-    <w:p>
-      <w:pPr>
-        <w:pStyle w:val="ListParagraph"/>
-      </w:pPr>
-      <w:r>
-        <w:t>Integrated COM and ATL with MFC………</w:t>
-      </w:r>
-    </w:p>
-    <w:p>
-      <w:pPr>
-        <w:pStyle w:val="ListParagraph"/>
-      </w:pPr>
-      <w:r>
-        <w:t>Transformed numerous ODs into a corresponding Class Diagram (CD)</w:t>
-      </w:r>
-    </w:p>
-    <w:p/>
-    <w:p>
-      <w:pPr>
-        <w:rPr>
-          <w:rFonts w:ascii="Aptos" w:hAnsi="Aptos"/>
-          <w:b/>
-          <w:bCs/>
-        </w:rPr>
-      </w:pPr>
-      <w:r>
-        <w:rPr>
-          <w:rFonts w:ascii="Aptos" w:hAnsi="Aptos"/>
-          <w:b/>
-          <w:bCs/>
-        </w:rPr>
-        <w:t>Business/Technology Value</w:t>
-      </w:r>
-    </w:p>
-    <w:p>
-      <w:pPr>
-        <w:pStyle w:val="ListParagraph"/>
-      </w:pPr>
-      <w:r>
-        <w:t>After implementation, company realized ROI of $</w:t>
-      </w:r>
-      <w:proofErr w:type="spellStart"/>
-      <w:proofErr w:type="gramStart"/>
-      <w:r>
-        <w:t>xxx.xx</w:t>
-      </w:r>
-      <w:proofErr w:type="spellEnd"/>
-      <w:proofErr w:type="gramEnd"/>
-    </w:p>
-    <w:p>
-      <w:pPr>
-        <w:spacing w:afterLines="0" w:after="200" w:line="276" w:lineRule="auto"/>
-        <w:contextualSpacing w:val="0"/>
-        <w:rPr>
-          <w:rFonts w:ascii="Aptos" w:hAnsi="Aptos"/>
-        </w:rPr>
-      </w:pPr>
-    </w:p>
     <w:sectPr>
-      <w:headerReference w:type="even" r:id="rId11"/>
-      <w:headerReference w:type="default" r:id="rId12"/>
-      <w:footerReference w:type="even" r:id="rId13"/>
-      <w:footerReference w:type="default" r:id="rId14"/>
-      <w:headerReference w:type="first" r:id="rId15"/>
-      <w:footerReference w:type="first" r:id="rId16"/>
       <w:pgSz w:w="12240" w:h="15840"/>
-      <w:pgMar w:top="570" w:right="720" w:bottom="1350" w:left="720" w:header="0" w:footer="0" w:gutter="0"/>
-      <w:cols w:space="720"/>
-      <w:docGrid w:linePitch="360"/>
+      <w:pgMar w:top="1440" w:right="1080" w:bottom="1440" w:left="1080" w:header="720" w:footer="720" w:gutter="0"/>
     </w:sectPr>
   </w:body>
 </w:document>

</xml_diff>

<commit_message>
feat: Update resume template structure for improved formatting and clarity; enhance data placeholders for roles, solutions, industries, and education sections
</commit_message>
<xml_diff>
--- a/templates/perficient-resume.docx
+++ b/templates/perficient-resume.docx
@@ -1,19 +1,11 @@
 
 <file path=word/document.xml><?xml version="1.0" encoding="utf-8"?>
 <w:document xmlns:wpc="http://schemas.microsoft.com/office/word/2010/wordprocessingCanvas" xmlns:cx="http://schemas.microsoft.com/office/drawing/2014/chartex" xmlns:cx1="http://schemas.microsoft.com/office/drawing/2015/9/8/chartex" xmlns:cx2="http://schemas.microsoft.com/office/drawing/2015/10/21/chartex" xmlns:cx3="http://schemas.microsoft.com/office/drawing/2016/5/9/chartex" xmlns:cx4="http://schemas.microsoft.com/office/drawing/2016/5/10/chartex" xmlns:cx5="http://schemas.microsoft.com/office/drawing/2016/5/11/chartex" xmlns:cx6="http://schemas.microsoft.com/office/drawing/2016/5/12/chartex" xmlns:cx7="http://schemas.microsoft.com/office/drawing/2016/5/13/chartex" xmlns:cx8="http://schemas.microsoft.com/office/drawing/2016/5/14/chartex" xmlns:mc="http://schemas.openxmlformats.org/markup-compatibility/2006" xmlns:aink="http://schemas.microsoft.com/office/drawing/2016/ink" xmlns:am3d="http://schemas.microsoft.com/office/drawing/2017/model3d" xmlns:o="urn:schemas-microsoft-com:office:office" xmlns:oel="http://schemas.microsoft.com/office/2019/extlst" xmlns:r="http://schemas.openxmlformats.org/officeDocument/2006/relationships" xmlns:m="http://schemas.openxmlformats.org/officeDocument/2006/math" xmlns:v="urn:schemas-microsoft-com:vml" xmlns:wp14="http://schemas.microsoft.com/office/word/2010/wordprocessingDrawing" xmlns:wp="http://schemas.openxmlformats.org/drawingml/2006/wordprocessingDrawing" xmlns:w10="urn:schemas-microsoft-com:office:word" xmlns:w="http://schemas.openxmlformats.org/wordprocessingml/2006/main" xmlns:w14="http://schemas.microsoft.com/office/word/2010/wordml" xmlns:w15="http://schemas.microsoft.com/office/word/2012/wordml" xmlns:w16cex="http://schemas.microsoft.com/office/word/2018/wordml/cex" xmlns:w16cid="http://schemas.microsoft.com/office/word/2016/wordml/cid" xmlns:w16="http://schemas.microsoft.com/office/word/2018/wordml" xmlns:w16du="http://schemas.microsoft.com/office/word/2023/wordml/word16du" xmlns:w16sdtdh="http://schemas.microsoft.com/office/word/2020/wordml/sdtdatahash" xmlns:w16sdtfl="http://schemas.microsoft.com/office/word/2024/wordml/sdtformatlock" xmlns:w16se="http://schemas.microsoft.com/office/word/2015/wordml/symex" xmlns:wpg="http://schemas.microsoft.com/office/word/2010/wordprocessingGroup" xmlns:wpi="http://schemas.microsoft.com/office/word/2010/wordprocessingInk" xmlns:wne="http://schemas.microsoft.com/office/word/2006/wordml" xmlns:wps="http://schemas.microsoft.com/office/word/2010/wordprocessingShape" mc:Ignorable="w14 w15 w16se w16cid w16 w16cex w16sdtdh w16sdtfl w16du wp14">
+  <w:background w:color="FFFFFF" w:themeColor="background1"/>
   <w:body>
     <w:p>
       <w:pPr>
         <w:pStyle w:val="Heading1"/>
-      </w:pPr>
-      <w:r>
-        <w:t>{firstName} {lastName}</w:t>
-      </w:r>
-    </w:p>
-    <w:p>
-      <w:pPr>
-        <w:pStyle w:val="BodyText"/>
-        <w:jc w:val="right"/>
         <w:rPr>
           <w:rFonts w:ascii="Aptos" w:hAnsi="Aptos"/>
           <w:sz w:val="24"/>
@@ -22,14 +14,179 @@
       </w:pPr>
       <w:r>
         <w:rPr>
-          <w:rFonts w:ascii="Aptos" w:hAnsi="Aptos"/>
+          <w:noProof/>
           <w:sz w:val="24"/>
           <w:szCs w:val="24"/>
         </w:rPr>
-        <w:t>{title}</w:t>
+        <mc:AlternateContent>
+          <mc:Choice Requires="wps">
+            <w:drawing>
+              <wp:anchor distT="0" distB="0" distL="114300" distR="114300" simplePos="0" relativeHeight="251661312" behindDoc="0" locked="0" layoutInCell="1" allowOverlap="1" wp14:anchorId="27C48A7F" wp14:editId="2C9E91BC">
+                <wp:simplePos x="0" y="0"/>
+                <wp:positionH relativeFrom="margin">
+                  <wp:align>right</wp:align>
+                </wp:positionH>
+                <wp:positionV relativeFrom="page">
+                  <wp:posOffset>502285</wp:posOffset>
+                </wp:positionV>
+                <wp:extent cx="4273550" cy="577850"/>
+                <wp:effectExtent l="0" t="0" r="0" b="0"/>
+                <wp:wrapNone/>
+                <wp:docPr id="1582479565" name="Text Box 14"/>
+                <wp:cNvGraphicFramePr/>
+                <a:graphic xmlns:a="http://schemas.openxmlformats.org/drawingml/2006/main">
+                  <a:graphicData uri="http://schemas.microsoft.com/office/word/2010/wordprocessingShape">
+                    <wps:wsp>
+                      <wps:cNvSpPr txBox="1"/>
+                      <wps:spPr>
+                        <a:xfrm>
+                          <a:off x="0" y="0"/>
+                          <a:ext cx="4273550" cy="577850"/>
+                        </a:xfrm>
+                        <a:prstGeom prst="rect">
+                          <a:avLst/>
+                        </a:prstGeom>
+                        <a:noFill/>
+                        <a:ln w="6350">
+                          <a:noFill/>
+                        </a:ln>
+                      </wps:spPr>
+                      <wps:txbx>
+                        <w:txbxContent>
+                          <w:p>
+                            <w:pPr>
+                              <w:pStyle w:val="Heading1"/>
+                            </w:pPr>
+                            <w:r>
+                              <w:t>{</w:t>
+                            </w:r>
+                            <w:proofErr w:type="spellStart"/>
+                            <w:r>
+                              <w:t>firstName</w:t>
+                            </w:r>
+                            <w:proofErr w:type="spellEnd"/>
+                            <w:r>
+                              <w:t>} {</w:t>
+                            </w:r>
+                            <w:proofErr w:type="spellStart"/>
+                            <w:r>
+                              <w:t>lastName</w:t>
+                            </w:r>
+                            <w:proofErr w:type="spellEnd"/>
+                            <w:r>
+                              <w:t>}</w:t>
+                            </w:r>
+                          </w:p>
+                          <w:p>
+                            <w:pPr>
+                              <w:pStyle w:val="BodyText"/>
+                              <w:jc w:val="right"/>
+                              <w:rPr>
+                                <w:rFonts w:ascii="Aptos" w:hAnsi="Aptos"/>
+                                <w:sz w:val="24"/>
+                                <w:szCs w:val="24"/>
+                              </w:rPr>
+                            </w:pPr>
+                            <w:r>
+                              <w:rPr>
+                                <w:rFonts w:ascii="Aptos" w:hAnsi="Aptos"/>
+                                <w:sz w:val="24"/>
+                                <w:szCs w:val="24"/>
+                              </w:rPr>
+                              <w:t>{title}</w:t>
+                            </w:r>
+                          </w:p>
+                          <w:p>
+                            <w:pPr>
+                              <w:pStyle w:val="Heading1"/>
+                            </w:pPr>
+                          </w:p>
+                        </w:txbxContent>
+                      </wps:txbx>
+                      <wps:bodyPr rot="0" spcFirstLastPara="0" vertOverflow="overflow" horzOverflow="overflow" vert="horz" wrap="square" lIns="91440" tIns="45720" rIns="91440" bIns="45720" numCol="1" spcCol="0" rtlCol="0" fromWordArt="0" anchor="t" anchorCtr="0" forceAA="0" compatLnSpc="1">
+                        <a:prstTxWarp prst="textNoShape">
+                          <a:avLst/>
+                        </a:prstTxWarp>
+                        <a:noAutofit/>
+                      </wps:bodyPr>
+                    </wps:wsp>
+                  </a:graphicData>
+                </a:graphic>
+                <wp14:sizeRelH relativeFrom="margin">
+                  <wp14:pctWidth>0</wp14:pctWidth>
+                </wp14:sizeRelH>
+                <wp14:sizeRelV relativeFrom="margin">
+                  <wp14:pctHeight>0</wp14:pctHeight>
+                </wp14:sizeRelV>
+              </wp:anchor>
+            </w:drawing>
+          </mc:Choice>
+          <mc:Fallback>
+            <w:pict>
+              <v:shapetype w14:anchorId="27C48A7F" id="_x0000_t202" coordsize="21600,21600" o:spt="202" path="m,l,21600r21600,l21600,xe">
+                <v:stroke joinstyle="miter"/>
+                <v:path gradientshapeok="t" o:connecttype="rect"/>
+              </v:shapetype>
+              <v:shape id="Text Box 14" o:spid="_x0000_s1026" type="#_x0000_t202" style="position:absolute;left:0;text-align:left;margin-left:285.3pt;margin-top:39.55pt;width:336.5pt;height:45.5pt;z-index:251661312;visibility:visible;mso-wrap-style:square;mso-width-percent:0;mso-height-percent:0;mso-wrap-distance-left:9pt;mso-wrap-distance-top:0;mso-wrap-distance-right:9pt;mso-wrap-distance-bottom:0;mso-position-horizontal:right;mso-position-horizontal-relative:margin;mso-position-vertical:absolute;mso-position-vertical-relative:page;mso-width-percent:0;mso-height-percent:0;mso-width-relative:margin;mso-height-relative:margin;v-text-anchor:top" o:gfxdata="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" filled="f" stroked="f" strokeweight=".5pt">
+                <v:textbox>
+                  <w:txbxContent>
+                    <w:p>
+                      <w:pPr>
+                        <w:pStyle w:val="Heading1"/>
+                      </w:pPr>
+                      <w:r>
+                        <w:t>{</w:t>
+                      </w:r>
+                      <w:proofErr w:type="spellStart"/>
+                      <w:r>
+                        <w:t>firstName</w:t>
+                      </w:r>
+                      <w:proofErr w:type="spellEnd"/>
+                      <w:r>
+                        <w:t>} {</w:t>
+                      </w:r>
+                      <w:proofErr w:type="spellStart"/>
+                      <w:r>
+                        <w:t>lastName</w:t>
+                      </w:r>
+                      <w:proofErr w:type="spellEnd"/>
+                      <w:r>
+                        <w:t>}</w:t>
+                      </w:r>
+                    </w:p>
+                    <w:p>
+                      <w:pPr>
+                        <w:pStyle w:val="BodyText"/>
+                        <w:jc w:val="right"/>
+                        <w:rPr>
+                          <w:rFonts w:ascii="Aptos" w:hAnsi="Aptos"/>
+                          <w:sz w:val="24"/>
+                          <w:szCs w:val="24"/>
+                        </w:rPr>
+                      </w:pPr>
+                      <w:r>
+                        <w:rPr>
+                          <w:rFonts w:ascii="Aptos" w:hAnsi="Aptos"/>
+                          <w:sz w:val="24"/>
+                          <w:szCs w:val="24"/>
+                        </w:rPr>
+                        <w:t>{title}</w:t>
+                      </w:r>
+                    </w:p>
+                    <w:p>
+                      <w:pPr>
+                        <w:pStyle w:val="Heading1"/>
+                      </w:pPr>
+                    </w:p>
+                  </w:txbxContent>
+                </v:textbox>
+                <w10:wrap anchorx="margin" anchory="page"/>
+              </v:shape>
+            </w:pict>
+          </mc:Fallback>
+        </mc:AlternateContent>
       </w:r>
     </w:p>
-    <w:p/>
     <w:p>
       <w:pPr>
         <w:pStyle w:val="05Header3"/>
@@ -49,7 +206,15 @@
         <w:pStyle w:val="09BodyCopy"/>
       </w:pPr>
       <w:r>
-        <w:t>{professionalOverview}</w:t>
+        <w:t>{</w:t>
+      </w:r>
+      <w:proofErr w:type="spellStart"/>
+      <w:r>
+        <w:t>professionalOverview</w:t>
+      </w:r>
+      <w:proofErr w:type="spellEnd"/>
+      <w:r>
+        <w:t>}</w:t>
       </w:r>
     </w:p>
     <w:p/>
@@ -108,9 +273,11 @@
             <w:pPr>
               <w:pStyle w:val="ListParagraph"/>
             </w:pPr>
+            <w:proofErr w:type="gramStart"/>
             <w:r>
               <w:t>{.}</w:t>
             </w:r>
+            <w:proofErr w:type="gramEnd"/>
           </w:p>
           <w:p>
             <w:r>
@@ -155,9 +322,11 @@
             <w:pPr>
               <w:pStyle w:val="ListParagraph"/>
             </w:pPr>
+            <w:proofErr w:type="gramStart"/>
             <w:r>
               <w:t>{.}</w:t>
             </w:r>
+            <w:proofErr w:type="gramEnd"/>
           </w:p>
           <w:p>
             <w:r>
@@ -202,9 +371,11 @@
             <w:pPr>
               <w:pStyle w:val="ListParagraph"/>
             </w:pPr>
+            <w:proofErr w:type="gramStart"/>
             <w:r>
               <w:t>{.}</w:t>
             </w:r>
+            <w:proofErr w:type="gramEnd"/>
           </w:p>
           <w:p>
             <w:r>
@@ -249,9 +420,11 @@
             <w:pPr>
               <w:pStyle w:val="ListParagraph"/>
             </w:pPr>
+            <w:proofErr w:type="gramStart"/>
             <w:r>
               <w:t>{.}</w:t>
             </w:r>
+            <w:proofErr w:type="gramEnd"/>
           </w:p>
           <w:p>
             <w:r>
@@ -285,9 +458,9 @@
         <w:tblLook w:val="0000" w:firstRow="0" w:lastRow="0" w:firstColumn="0" w:lastColumn="0" w:noHBand="0" w:noVBand="0"/>
       </w:tblPr>
       <w:tblGrid>
-        <w:gridCol w:w="2587"/>
-        <w:gridCol w:w="1800"/>
-        <w:gridCol w:w="5873"/>
+        <w:gridCol w:w="2833"/>
+        <w:gridCol w:w="1731"/>
+        <w:gridCol w:w="5696"/>
       </w:tblGrid>
       <w:tr>
         <w:tc>
@@ -299,7 +472,15 @@
               <w:pStyle w:val="09BodyCopy"/>
             </w:pPr>
             <w:r>
-              <w:t>{#keyEngagements}{company}</w:t>
+              <w:t>{#</w:t>
+            </w:r>
+            <w:proofErr w:type="gramStart"/>
+            <w:r>
+              <w:t>keyEngagements}{</w:t>
+            </w:r>
+            <w:proofErr w:type="gramEnd"/>
+            <w:r>
+              <w:t>company}</w:t>
             </w:r>
           </w:p>
         </w:tc>
@@ -324,8 +505,18 @@
             <w:pPr>
               <w:pStyle w:val="09BodyCopy"/>
             </w:pPr>
+            <w:proofErr w:type="gramStart"/>
             <w:r>
-              <w:t>{description}{/keyEngagements}</w:t>
+              <w:t>{description}{/</w:t>
+            </w:r>
+            <w:proofErr w:type="spellStart"/>
+            <w:proofErr w:type="gramEnd"/>
+            <w:r>
+              <w:t>keyEngagements</w:t>
+            </w:r>
+            <w:proofErr w:type="spellEnd"/>
+            <w:r>
+              <w:t>}</w:t>
             </w:r>
           </w:p>
         </w:tc>
@@ -384,13 +575,23 @@
                 <w:szCs w:val="20"/>
               </w:rPr>
             </w:pPr>
+            <w:proofErr w:type="gramStart"/>
             <w:r>
               <w:rPr>
                 <w:rFonts w:ascii="Aptos" w:hAnsi="Aptos"/>
                 <w:sz w:val="20"/>
                 <w:szCs w:val="20"/>
               </w:rPr>
-              <w:t>{degree}, {institution} {year}</w:t>
+              <w:t>{degree}, {</w:t>
+            </w:r>
+            <w:proofErr w:type="gramEnd"/>
+            <w:r>
+              <w:rPr>
+                <w:rFonts w:ascii="Aptos" w:hAnsi="Aptos"/>
+                <w:sz w:val="20"/>
+                <w:szCs w:val="20"/>
+              </w:rPr>
+              <w:t>institution} {year}</w:t>
             </w:r>
           </w:p>
           <w:p>
@@ -432,6 +633,7 @@
                 <w:szCs w:val="20"/>
               </w:rPr>
             </w:pPr>
+            <w:proofErr w:type="gramStart"/>
             <w:r>
               <w:rPr>
                 <w:rFonts w:ascii="Aptos" w:hAnsi="Aptos"/>
@@ -440,6 +642,7 @@
               </w:rPr>
               <w:t>{.}</w:t>
             </w:r>
+            <w:proofErr w:type="gramEnd"/>
           </w:p>
           <w:p>
             <w:r>
@@ -452,21 +655,105 @@
     <w:p/>
     <w:p>
       <w:pPr>
-        <w:pStyle w:val="08Heading6"/>
+        <w:spacing w:afterLines="0" w:after="200" w:line="276" w:lineRule="auto"/>
+        <w:contextualSpacing w:val="0"/>
       </w:pPr>
       <w:r>
-        <w:t>PROFESSIONAL AND BUSINESS EXPERIENCE</w:t>
+        <w:br w:type="page"/>
       </w:r>
     </w:p>
     <w:p>
-      <w:pPr>
-        <w:pStyle w:val="07Heading5"/>
-      </w:pPr>
       <w:r>
-        <w:t>PERFICIENT, INC.</w:t>
+        <w:rPr>
+          <w:noProof/>
+          <w:sz w:val="24"/>
+        </w:rPr>
+        <w:lastRenderedPageBreak/>
+        <mc:AlternateContent>
+          <mc:Choice Requires="wps">
+            <w:drawing>
+              <wp:anchor distT="0" distB="0" distL="114300" distR="114300" simplePos="0" relativeHeight="251659264" behindDoc="0" locked="0" layoutInCell="1" allowOverlap="1" wp14:anchorId="1B9DC23A" wp14:editId="34056095">
+                <wp:simplePos x="0" y="0"/>
+                <wp:positionH relativeFrom="margin">
+                  <wp:posOffset>2298700</wp:posOffset>
+                </wp:positionH>
+                <wp:positionV relativeFrom="page">
+                  <wp:posOffset>490220</wp:posOffset>
+                </wp:positionV>
+                <wp:extent cx="4273550" cy="408305"/>
+                <wp:effectExtent l="0" t="0" r="0" b="0"/>
+                <wp:wrapNone/>
+                <wp:docPr id="715511671" name="Text Box 14"/>
+                <wp:cNvGraphicFramePr/>
+                <a:graphic xmlns:a="http://schemas.openxmlformats.org/drawingml/2006/main">
+                  <a:graphicData uri="http://schemas.microsoft.com/office/word/2010/wordprocessingShape">
+                    <wps:wsp>
+                      <wps:cNvSpPr txBox="1"/>
+                      <wps:spPr>
+                        <a:xfrm>
+                          <a:off x="0" y="0"/>
+                          <a:ext cx="4273550" cy="408305"/>
+                        </a:xfrm>
+                        <a:prstGeom prst="rect">
+                          <a:avLst/>
+                        </a:prstGeom>
+                        <a:noFill/>
+                        <a:ln w="6350">
+                          <a:noFill/>
+                        </a:ln>
+                      </wps:spPr>
+                      <wps:txbx>
+                        <w:txbxContent>
+                          <w:p>
+                            <w:pPr>
+                              <w:pStyle w:val="Heading1"/>
+                            </w:pPr>
+                            <w:r>
+                              <w:t>PROFESSIONAL AND BUSINESS EXPERIENCE</w:t>
+                            </w:r>
+                          </w:p>
+                        </w:txbxContent>
+                      </wps:txbx>
+                      <wps:bodyPr rot="0" spcFirstLastPara="0" vertOverflow="overflow" horzOverflow="overflow" vert="horz" wrap="square" lIns="91440" tIns="45720" rIns="91440" bIns="45720" numCol="1" spcCol="0" rtlCol="0" fromWordArt="0" anchor="t" anchorCtr="0" forceAA="0" compatLnSpc="1">
+                        <a:prstTxWarp prst="textNoShape">
+                          <a:avLst/>
+                        </a:prstTxWarp>
+                        <a:noAutofit/>
+                      </wps:bodyPr>
+                    </wps:wsp>
+                  </a:graphicData>
+                </a:graphic>
+                <wp14:sizeRelH relativeFrom="margin">
+                  <wp14:pctWidth>0</wp14:pctWidth>
+                </wp14:sizeRelH>
+                <wp14:sizeRelV relativeFrom="margin">
+                  <wp14:pctHeight>0</wp14:pctHeight>
+                </wp14:sizeRelV>
+              </wp:anchor>
+            </w:drawing>
+          </mc:Choice>
+          <mc:Fallback>
+            <w:pict>
+              <v:shape w14:anchorId="1B9DC23A" id="_x0000_s1027" type="#_x0000_t202" style="position:absolute;margin-left:181pt;margin-top:38.6pt;width:336.5pt;height:32.15pt;z-index:251659264;visibility:visible;mso-wrap-style:square;mso-width-percent:0;mso-height-percent:0;mso-wrap-distance-left:9pt;mso-wrap-distance-top:0;mso-wrap-distance-right:9pt;mso-wrap-distance-bottom:0;mso-position-horizontal:absolute;mso-position-horizontal-relative:margin;mso-position-vertical:absolute;mso-position-vertical-relative:page;mso-width-percent:0;mso-height-percent:0;mso-width-relative:margin;mso-height-relative:margin;v-text-anchor:top" o:gfxdata="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" filled="f" stroked="f" strokeweight=".5pt">
+                <v:textbox>
+                  <w:txbxContent>
+                    <w:p>
+                      <w:pPr>
+                        <w:pStyle w:val="Heading1"/>
+                      </w:pPr>
+                      <w:r>
+                        <w:t>PROFESSIONAL AND BUSINESS EXPERIENCE</w:t>
+                      </w:r>
+                    </w:p>
+                  </w:txbxContent>
+                </v:textbox>
+                <w10:wrap anchorx="margin" anchory="page"/>
+              </v:shape>
+            </w:pict>
+          </mc:Fallback>
+        </mc:AlternateContent>
       </w:r>
     </w:p>
-    <w:p/>
     <w:p>
       <w:r>
         <w:t>{#experience}</w:t>
@@ -474,71 +761,81 @@
     </w:p>
     <w:p>
       <w:pPr>
-        <w:pStyle w:val="Title"/>
+        <w:pStyle w:val="Heading1"/>
+        <w:tabs>
+          <w:tab w:val="right" w:pos="9072"/>
+        </w:tabs>
+        <w:ind w:left="0"/>
+        <w:jc w:val="left"/>
+        <w:rPr>
+          <w:sz w:val="24"/>
+        </w:rPr>
       </w:pPr>
       <w:r>
+        <w:rPr>
+          <w:sz w:val="28"/>
+          <w:szCs w:val="28"/>
+        </w:rPr>
+        <w:t>{client}</w:t>
+      </w:r>
+      <w:r>
+        <w:rPr>
+          <w:sz w:val="28"/>
+          <w:szCs w:val="28"/>
+        </w:rPr>
+        <w:tab/>
+      </w:r>
+      <w:r>
+        <w:rPr>
+          <w:sz w:val="28"/>
+          <w:szCs w:val="28"/>
+        </w:rPr>
+        <w:t>{period}</w:t>
+      </w:r>
+    </w:p>
+    <w:p>
+      <w:pPr>
+        <w:pStyle w:val="07Heading5"/>
+        <w:spacing w:afterLines="0" w:after="0"/>
+        <w:ind w:left="0"/>
+        <w:contextualSpacing w:val="0"/>
+        <w:rPr>
+          <w:sz w:val="24"/>
+        </w:rPr>
+      </w:pPr>
+      <w:r>
+        <w:rPr>
+          <w:sz w:val="24"/>
+        </w:rPr>
         <w:t>{role}</w:t>
       </w:r>
     </w:p>
     <w:p>
       <w:pPr>
-        <w:rPr>
-          <w:rFonts w:ascii="Aptos" w:hAnsi="Aptos"/>
-        </w:rPr>
+        <w:pStyle w:val="09BodyCopy"/>
       </w:pPr>
       <w:r>
+        <w:t>{</w:t>
+      </w:r>
+      <w:proofErr w:type="spellStart"/>
+      <w:r>
+        <w:t>projectDescription</w:t>
+      </w:r>
+      <w:proofErr w:type="spellEnd"/>
+      <w:r>
+        <w:t>}</w:t>
+      </w:r>
+    </w:p>
+    <w:p/>
+    <w:p>
+      <w:pPr>
         <w:rPr>
           <w:rFonts w:ascii="Aptos" w:hAnsi="Aptos"/>
           <w:b/>
           <w:bCs/>
         </w:rPr>
-        <w:t xml:space="preserve">CLIENT: </w:t>
-      </w:r>
-      <w:r>
-        <w:rPr>
-          <w:rFonts w:ascii="Aptos" w:hAnsi="Aptos"/>
-        </w:rPr>
-        <w:t>{client}</w:t>
-      </w:r>
-    </w:p>
-    <w:p>
-      <w:pPr>
-        <w:rPr>
-          <w:rFonts w:ascii="Aptos" w:hAnsi="Aptos"/>
-        </w:rPr>
-      </w:pPr>
-      <w:r>
-        <w:rPr>
-          <w:rFonts w:ascii="Aptos" w:hAnsi="Aptos"/>
-          <w:b/>
-          <w:bCs/>
-        </w:rPr>
-        <w:t xml:space="preserve">PERIOD: </w:t>
-      </w:r>
-      <w:r>
-        <w:rPr>
-          <w:rFonts w:ascii="Aptos" w:hAnsi="Aptos"/>
-        </w:rPr>
-        <w:t>{period}</w:t>
-      </w:r>
-    </w:p>
-    <w:p>
-      <w:pPr>
-        <w:pStyle w:val="09BodyCopy"/>
-      </w:pPr>
-      <w:r>
-        <w:t>{projectDescription}</w:t>
-      </w:r>
-    </w:p>
-    <w:p/>
-    <w:p>
-      <w:pPr>
-        <w:rPr>
-          <w:rFonts w:ascii="Aptos" w:hAnsi="Aptos"/>
-          <w:b/>
-          <w:bCs/>
-        </w:rPr>
-      </w:pPr>
+      </w:pPr>
+      <w:proofErr w:type="gramStart"/>
       <w:r>
         <w:rPr>
           <w:rFonts w:ascii="Aptos" w:hAnsi="Aptos"/>
@@ -547,6 +844,7 @@
         </w:rPr>
         <w:t>Responsibilities:</w:t>
       </w:r>
+      <w:proofErr w:type="gramEnd"/>
     </w:p>
     <w:p>
       <w:r>
@@ -557,9 +855,11 @@
       <w:pPr>
         <w:pStyle w:val="ListParagraph"/>
       </w:pPr>
+      <w:proofErr w:type="gramStart"/>
       <w:r>
         <w:t>{.}</w:t>
       </w:r>
+      <w:proofErr w:type="gramEnd"/>
     </w:p>
     <w:p>
       <w:r>
@@ -593,13 +893,23 @@
       <w:pPr>
         <w:pStyle w:val="ListParagraph"/>
       </w:pPr>
+      <w:proofErr w:type="gramStart"/>
       <w:r>
         <w:t>{.}</w:t>
       </w:r>
+      <w:proofErr w:type="gramEnd"/>
     </w:p>
     <w:p>
       <w:r>
-        <w:t>{/businessValue}</w:t>
+        <w:t>{/</w:t>
+      </w:r>
+      <w:proofErr w:type="spellStart"/>
+      <w:r>
+        <w:t>businessValue</w:t>
+      </w:r>
+      <w:proofErr w:type="spellEnd"/>
+      <w:r>
+        <w:t>}</w:t>
       </w:r>
     </w:p>
     <w:p/>
@@ -609,8 +919,15 @@
       </w:r>
     </w:p>
     <w:sectPr>
+      <w:headerReference w:type="even" r:id="rId11"/>
+      <w:headerReference w:type="default" r:id="rId12"/>
+      <w:footerReference w:type="even" r:id="rId13"/>
+      <w:footerReference w:type="default" r:id="rId14"/>
+      <w:headerReference w:type="first" r:id="rId15"/>
+      <w:footerReference w:type="first" r:id="rId16"/>
       <w:pgSz w:w="12240" w:h="15840"/>
       <w:pgMar w:top="1440" w:right="1080" w:bottom="1440" w:left="1080" w:header="720" w:footer="720" w:gutter="0"/>
+      <w:cols w:space="720"/>
     </w:sectPr>
   </w:body>
 </w:document>
@@ -652,32 +969,10 @@
 <w:ftr xmlns:wpc="http://schemas.microsoft.com/office/word/2010/wordprocessingCanvas" xmlns:cx="http://schemas.microsoft.com/office/drawing/2014/chartex" xmlns:cx1="http://schemas.microsoft.com/office/drawing/2015/9/8/chartex" xmlns:cx2="http://schemas.microsoft.com/office/drawing/2015/10/21/chartex" xmlns:cx3="http://schemas.microsoft.com/office/drawing/2016/5/9/chartex" xmlns:cx4="http://schemas.microsoft.com/office/drawing/2016/5/10/chartex" xmlns:cx5="http://schemas.microsoft.com/office/drawing/2016/5/11/chartex" xmlns:cx6="http://schemas.microsoft.com/office/drawing/2016/5/12/chartex" xmlns:cx7="http://schemas.microsoft.com/office/drawing/2016/5/13/chartex" xmlns:cx8="http://schemas.microsoft.com/office/drawing/2016/5/14/chartex" xmlns:mc="http://schemas.openxmlformats.org/markup-compatibility/2006" xmlns:aink="http://schemas.microsoft.com/office/drawing/2016/ink" xmlns:am3d="http://schemas.microsoft.com/office/drawing/2017/model3d" xmlns:o="urn:schemas-microsoft-com:office:office" xmlns:oel="http://schemas.microsoft.com/office/2019/extlst" xmlns:r="http://schemas.openxmlformats.org/officeDocument/2006/relationships" xmlns:m="http://schemas.openxmlformats.org/officeDocument/2006/math" xmlns:v="urn:schemas-microsoft-com:vml" xmlns:wp14="http://schemas.microsoft.com/office/word/2010/wordprocessingDrawing" xmlns:wp="http://schemas.openxmlformats.org/drawingml/2006/wordprocessingDrawing" xmlns:w10="urn:schemas-microsoft-com:office:word" xmlns:w="http://schemas.openxmlformats.org/wordprocessingml/2006/main" xmlns:w14="http://schemas.microsoft.com/office/word/2010/wordml" xmlns:w15="http://schemas.microsoft.com/office/word/2012/wordml" xmlns:w16cex="http://schemas.microsoft.com/office/word/2018/wordml/cex" xmlns:w16cid="http://schemas.microsoft.com/office/word/2016/wordml/cid" xmlns:w16="http://schemas.microsoft.com/office/word/2018/wordml" xmlns:w16du="http://schemas.microsoft.com/office/word/2023/wordml/word16du" xmlns:w16sdtdh="http://schemas.microsoft.com/office/word/2020/wordml/sdtdatahash" xmlns:w16sdtfl="http://schemas.microsoft.com/office/word/2024/wordml/sdtformatlock" xmlns:w16se="http://schemas.microsoft.com/office/word/2015/wordml/symex" xmlns:wpg="http://schemas.microsoft.com/office/word/2010/wordprocessingGroup" xmlns:wpi="http://schemas.microsoft.com/office/word/2010/wordprocessingInk" xmlns:wne="http://schemas.microsoft.com/office/word/2006/wordml" xmlns:wps="http://schemas.microsoft.com/office/word/2010/wordprocessingShape" mc:Ignorable="w14 w15 w16se w16cid w16 w16cex w16sdtdh w16sdtfl w16du wp14">
   <w:p>
     <w:pPr>
-      <w:rPr>
-        <w:rStyle w:val="PageNumber"/>
-      </w:rPr>
-    </w:pPr>
-    <w:r>
-      <w:rPr>
-        <w:rStyle w:val="PageNumber"/>
-      </w:rPr>
-      <w:fldChar w:fldCharType="begin"/>
-    </w:r>
-    <w:r>
-      <w:rPr>
-        <w:rStyle w:val="PageNumber"/>
-      </w:rPr>
-      <w:instrText xml:space="preserve">PAGE  </w:instrText>
-    </w:r>
-    <w:r>
-      <w:rPr>
-        <w:rStyle w:val="PageNumber"/>
-      </w:rPr>
-      <w:fldChar w:fldCharType="end"/>
-    </w:r>
+      <w:pStyle w:val="Footer"/>
+      <w:spacing w:after="96"/>
+    </w:pPr>
   </w:p>
-  <w:p/>
-  <w:p/>
-  <w:p/>
 </w:ftr>
 </file>
 
@@ -687,487 +982,6 @@
     <w:pPr>
       <w:pStyle w:val="Footer"/>
       <w:spacing w:after="96"/>
-      <w:jc w:val="right"/>
-    </w:pPr>
-    <w:r>
-      <w:rPr>
-        <w:noProof/>
-      </w:rPr>
-      <mc:AlternateContent>
-        <mc:Choice Requires="wps">
-          <w:drawing>
-            <wp:anchor distT="0" distB="0" distL="114300" distR="114300" simplePos="0" relativeHeight="251661315" behindDoc="0" locked="0" layoutInCell="1" allowOverlap="1" wp14:anchorId="5E198979" wp14:editId="556DA770">
-              <wp:simplePos x="0" y="0"/>
-              <wp:positionH relativeFrom="margin">
-                <wp:posOffset>139700</wp:posOffset>
-              </wp:positionH>
-              <wp:positionV relativeFrom="page">
-                <wp:posOffset>9404350</wp:posOffset>
-              </wp:positionV>
-              <wp:extent cx="1708150" cy="297815"/>
-              <wp:effectExtent l="0" t="0" r="6350" b="6985"/>
-              <wp:wrapNone/>
-              <wp:docPr id="2" name="Text Box 2"/>
-              <wp:cNvGraphicFramePr>
-                <a:graphicFrameLocks xmlns:a="http://schemas.openxmlformats.org/drawingml/2006/main"/>
-              </wp:cNvGraphicFramePr>
-              <a:graphic xmlns:a="http://schemas.openxmlformats.org/drawingml/2006/main">
-                <a:graphicData uri="http://schemas.microsoft.com/office/word/2010/wordprocessingShape">
-                  <wps:wsp>
-                    <wps:cNvSpPr txBox="1">
-                      <a:spLocks noChangeArrowheads="1"/>
-                    </wps:cNvSpPr>
-                    <wps:spPr bwMode="auto">
-                      <a:xfrm>
-                        <a:off x="0" y="0"/>
-                        <a:ext cx="1708150" cy="297815"/>
-                      </a:xfrm>
-                      <a:prstGeom prst="rect">
-                        <a:avLst/>
-                      </a:prstGeom>
-                      <a:noFill/>
-                      <a:ln>
-                        <a:noFill/>
-                      </a:ln>
-                      <a:extLst>
-                        <a:ext uri="{909E8E84-426E-40DD-AFC4-6F175D3DCCD1}">
-                          <a14:hiddenFill xmlns:a14="http://schemas.microsoft.com/office/drawing/2010/main">
-                            <a:solidFill>
-                              <a:srgbClr val="FFFFFF"/>
-                            </a:solidFill>
-                          </a14:hiddenFill>
-                        </a:ext>
-                        <a:ext uri="{91240B29-F687-4F45-9708-019B960494DF}">
-                          <a14:hiddenLine xmlns:a14="http://schemas.microsoft.com/office/drawing/2010/main" w="9525">
-                            <a:solidFill>
-                              <a:srgbClr val="000000"/>
-                            </a:solidFill>
-                            <a:miter lim="800000"/>
-                            <a:headEnd/>
-                            <a:tailEnd/>
-                          </a14:hiddenLine>
-                        </a:ext>
-                      </a:extLst>
-                    </wps:spPr>
-                    <wps:txbx>
-                      <w:txbxContent>
-                        <w:p>
-                          <w:pPr>
-                            <w:pStyle w:val="Footer"/>
-                            <w:spacing w:after="96"/>
-                            <w:jc w:val="both"/>
-                            <w:rPr>
-                              <w:rFonts w:ascii="Aptos" w:hAnsi="Aptos"/>
-                              <w:sz w:val="16"/>
-                              <w:szCs w:val="16"/>
-                            </w:rPr>
-                          </w:pPr>
-                          <w:r>
-                            <w:rPr>
-                              <w:rFonts w:ascii="Aptos" w:hAnsi="Aptos"/>
-                              <w:sz w:val="16"/>
-                              <w:szCs w:val="16"/>
-                            </w:rPr>
-                            <w:t>PERFICIENT.COM</w:t>
-                          </w:r>
-                        </w:p>
-                        <w:p>
-                          <w:pPr>
-                            <w:pStyle w:val="Footer"/>
-                            <w:spacing w:after="96"/>
-                            <w:jc w:val="both"/>
-                            <w:rPr>
-                              <w:sz w:val="16"/>
-                              <w:szCs w:val="16"/>
-                            </w:rPr>
-                          </w:pPr>
-                        </w:p>
-                      </w:txbxContent>
-                    </wps:txbx>
-                    <wps:bodyPr rot="0" vert="horz" wrap="square" lIns="0" tIns="0" rIns="0" bIns="0" anchor="t" anchorCtr="0" upright="1">
-                      <a:noAutofit/>
-                    </wps:bodyPr>
-                  </wps:wsp>
-                </a:graphicData>
-              </a:graphic>
-              <wp14:sizeRelH relativeFrom="page">
-                <wp14:pctWidth>0</wp14:pctWidth>
-              </wp14:sizeRelH>
-              <wp14:sizeRelV relativeFrom="page">
-                <wp14:pctHeight>0</wp14:pctHeight>
-              </wp14:sizeRelV>
-            </wp:anchor>
-          </w:drawing>
-        </mc:Choice>
-        <mc:Fallback>
-          <w:pict>
-            <v:shapetype w14:anchorId="5E198979" id="_x0000_t202" coordsize="21600,21600" o:spt="202" path="m,l,21600r21600,l21600,xe">
-              <v:stroke joinstyle="miter"/>
-              <v:path gradientshapeok="t" o:connecttype="rect"/>
-            </v:shapetype>
-            <v:shape id="Text Box 2" o:spid="_x0000_s1030" type="#_x0000_t202" style="position:absolute;left:0;text-align:left;margin-left:11pt;margin-top:740.5pt;width:134.5pt;height:23.45pt;z-index:251661315;visibility:visible;mso-wrap-style:square;mso-width-percent:0;mso-height-percent:0;mso-wrap-distance-left:9pt;mso-wrap-distance-top:0;mso-wrap-distance-right:9pt;mso-wrap-distance-bottom:0;mso-position-horizontal:absolute;mso-position-horizontal-relative:margin;mso-position-vertical:absolute;mso-position-vertical-relative:page;mso-width-percent:0;mso-height-percent:0;mso-width-relative:page;mso-height-relative:page;v-text-anchor:top" o:gfxdata="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" filled="f" stroked="f">
-              <v:textbox inset="0,0,0,0">
-                <w:txbxContent>
-                  <w:p>
-                    <w:pPr>
-                      <w:pStyle w:val="Footer"/>
-                      <w:spacing w:after="96"/>
-                      <w:jc w:val="both"/>
-                      <w:rPr>
-                        <w:rFonts w:ascii="Aptos" w:hAnsi="Aptos"/>
-                        <w:sz w:val="16"/>
-                        <w:szCs w:val="16"/>
-                      </w:rPr>
-                    </w:pPr>
-                    <w:r>
-                      <w:rPr>
-                        <w:rFonts w:ascii="Aptos" w:hAnsi="Aptos"/>
-                        <w:sz w:val="16"/>
-                        <w:szCs w:val="16"/>
-                      </w:rPr>
-                      <w:t>PERFICIENT.COM</w:t>
-                    </w:r>
-                  </w:p>
-                  <w:p>
-                    <w:pPr>
-                      <w:pStyle w:val="Footer"/>
-                      <w:spacing w:after="96"/>
-                      <w:jc w:val="both"/>
-                      <w:rPr>
-                        <w:sz w:val="16"/>
-                        <w:szCs w:val="16"/>
-                      </w:rPr>
-                    </w:pPr>
-                  </w:p>
-                </w:txbxContent>
-              </v:textbox>
-              <w10:wrap anchorx="margin" anchory="page"/>
-            </v:shape>
-          </w:pict>
-        </mc:Fallback>
-      </mc:AlternateContent>
-    </w:r>
-    <w:r>
-      <w:rPr>
-        <w:noProof/>
-      </w:rPr>
-      <mc:AlternateContent>
-        <mc:Choice Requires="wps">
-          <w:drawing>
-            <wp:anchor distT="0" distB="0" distL="114300" distR="114300" simplePos="0" relativeHeight="251662339" behindDoc="0" locked="0" layoutInCell="1" allowOverlap="1" wp14:anchorId="05751A88" wp14:editId="21835E5B">
-              <wp:simplePos x="0" y="0"/>
-              <wp:positionH relativeFrom="page">
-                <wp:posOffset>4933950</wp:posOffset>
-              </wp:positionH>
-              <wp:positionV relativeFrom="page">
-                <wp:posOffset>9417050</wp:posOffset>
-              </wp:positionV>
-              <wp:extent cx="2174240" cy="451485"/>
-              <wp:effectExtent l="0" t="0" r="16510" b="5715"/>
-              <wp:wrapNone/>
-              <wp:docPr id="990524072" name="Text Box 990524072"/>
-              <wp:cNvGraphicFramePr>
-                <a:graphicFrameLocks xmlns:a="http://schemas.openxmlformats.org/drawingml/2006/main"/>
-              </wp:cNvGraphicFramePr>
-              <a:graphic xmlns:a="http://schemas.openxmlformats.org/drawingml/2006/main">
-                <a:graphicData uri="http://schemas.microsoft.com/office/word/2010/wordprocessingShape">
-                  <wps:wsp>
-                    <wps:cNvSpPr txBox="1">
-                      <a:spLocks noChangeArrowheads="1"/>
-                    </wps:cNvSpPr>
-                    <wps:spPr bwMode="auto">
-                      <a:xfrm>
-                        <a:off x="0" y="0"/>
-                        <a:ext cx="2174240" cy="451485"/>
-                      </a:xfrm>
-                      <a:prstGeom prst="rect">
-                        <a:avLst/>
-                      </a:prstGeom>
-                      <a:noFill/>
-                      <a:ln>
-                        <a:noFill/>
-                      </a:ln>
-                      <a:extLst>
-                        <a:ext uri="{909E8E84-426E-40DD-AFC4-6F175D3DCCD1}">
-                          <a14:hiddenFill xmlns:a14="http://schemas.microsoft.com/office/drawing/2010/main">
-                            <a:solidFill>
-                              <a:srgbClr val="FFFFFF"/>
-                            </a:solidFill>
-                          </a14:hiddenFill>
-                        </a:ext>
-                        <a:ext uri="{91240B29-F687-4F45-9708-019B960494DF}">
-                          <a14:hiddenLine xmlns:a14="http://schemas.microsoft.com/office/drawing/2010/main" w="9525">
-                            <a:solidFill>
-                              <a:srgbClr val="000000"/>
-                            </a:solidFill>
-                            <a:miter lim="800000"/>
-                            <a:headEnd/>
-                            <a:tailEnd/>
-                          </a14:hiddenLine>
-                        </a:ext>
-                      </a:extLst>
-                    </wps:spPr>
-                    <wps:txbx>
-                      <w:txbxContent>
-                        <w:p>
-                          <w:pPr>
-                            <w:pStyle w:val="Footer"/>
-                            <w:spacing w:after="96"/>
-                            <w:jc w:val="right"/>
-                            <w:rPr>
-                              <w:rFonts w:ascii="Aptos" w:hAnsi="Aptos"/>
-                              <w:sz w:val="16"/>
-                              <w:szCs w:val="16"/>
-                            </w:rPr>
-                          </w:pPr>
-                          <w:r>
-                            <w:rPr>
-                              <w:rFonts w:ascii="Aptos" w:hAnsi="Aptos"/>
-                              <w:sz w:val="16"/>
-                              <w:szCs w:val="16"/>
-                            </w:rPr>
-                            <w:t>Proprietary and Confidential</w:t>
-                          </w:r>
-                        </w:p>
-                      </w:txbxContent>
-                    </wps:txbx>
-                    <wps:bodyPr rot="0" vert="horz" wrap="square" lIns="0" tIns="0" rIns="0" bIns="0" anchor="t" anchorCtr="0" upright="1">
-                      <a:noAutofit/>
-                    </wps:bodyPr>
-                  </wps:wsp>
-                </a:graphicData>
-              </a:graphic>
-              <wp14:sizeRelH relativeFrom="page">
-                <wp14:pctWidth>0</wp14:pctWidth>
-              </wp14:sizeRelH>
-              <wp14:sizeRelV relativeFrom="page">
-                <wp14:pctHeight>0</wp14:pctHeight>
-              </wp14:sizeRelV>
-            </wp:anchor>
-          </w:drawing>
-        </mc:Choice>
-        <mc:Fallback>
-          <w:pict>
-            <v:shape w14:anchorId="05751A88" id="Text Box 990524072" o:spid="_x0000_s1031" type="#_x0000_t202" style="position:absolute;left:0;text-align:left;margin-left:388.5pt;margin-top:741.5pt;width:171.2pt;height:35.55pt;z-index:251662339;visibility:visible;mso-wrap-style:square;mso-width-percent:0;mso-height-percent:0;mso-wrap-distance-left:9pt;mso-wrap-distance-top:0;mso-wrap-distance-right:9pt;mso-wrap-distance-bottom:0;mso-position-horizontal:absolute;mso-position-horizontal-relative:page;mso-position-vertical:absolute;mso-position-vertical-relative:page;mso-width-percent:0;mso-height-percent:0;mso-width-relative:page;mso-height-relative:page;v-text-anchor:top" o:gfxdata="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" filled="f" stroked="f">
-              <v:textbox inset="0,0,0,0">
-                <w:txbxContent>
-                  <w:p>
-                    <w:pPr>
-                      <w:pStyle w:val="Footer"/>
-                      <w:spacing w:after="96"/>
-                      <w:jc w:val="right"/>
-                      <w:rPr>
-                        <w:rFonts w:ascii="Aptos" w:hAnsi="Aptos"/>
-                        <w:sz w:val="16"/>
-                        <w:szCs w:val="16"/>
-                      </w:rPr>
-                    </w:pPr>
-                    <w:r>
-                      <w:rPr>
-                        <w:rFonts w:ascii="Aptos" w:hAnsi="Aptos"/>
-                        <w:sz w:val="16"/>
-                        <w:szCs w:val="16"/>
-                      </w:rPr>
-                      <w:t>Proprietary and Confidential</w:t>
-                    </w:r>
-                  </w:p>
-                </w:txbxContent>
-              </v:textbox>
-              <w10:wrap anchorx="page" anchory="page"/>
-            </v:shape>
-          </w:pict>
-        </mc:Fallback>
-      </mc:AlternateContent>
-    </w:r>
-    <w:sdt>
-      <w:sdtPr>
-        <w:id w:val="1446108624"/>
-        <w:docPartObj>
-          <w:docPartGallery w:val="Page Numbers (Bottom of Page)"/>
-          <w:docPartUnique/>
-        </w:docPartObj>
-      </w:sdtPr>
-      <w:sdtEndPr>
-        <w:rPr>
-          <w:noProof/>
-        </w:rPr>
-      </w:sdtEndPr>
-      <w:sdtContent>
-        <w:r>
-          <w:rPr>
-            <w:sz w:val="16"/>
-            <w:szCs w:val="16"/>
-          </w:rPr>
-          <w:fldChar w:fldCharType="begin"/>
-        </w:r>
-        <w:r>
-          <w:rPr>
-            <w:sz w:val="16"/>
-            <w:szCs w:val="16"/>
-          </w:rPr>
-          <w:instrText xml:space="preserve"> PAGE   \* MERGEFORMAT </w:instrText>
-        </w:r>
-        <w:r>
-          <w:rPr>
-            <w:sz w:val="16"/>
-            <w:szCs w:val="16"/>
-          </w:rPr>
-          <w:fldChar w:fldCharType="separate"/>
-        </w:r>
-        <w:r>
-          <w:rPr>
-            <w:noProof/>
-            <w:sz w:val="16"/>
-            <w:szCs w:val="16"/>
-          </w:rPr>
-          <w:t>2</w:t>
-        </w:r>
-        <w:r>
-          <w:rPr>
-            <w:noProof/>
-            <w:sz w:val="16"/>
-            <w:szCs w:val="16"/>
-          </w:rPr>
-          <w:fldChar w:fldCharType="end"/>
-        </w:r>
-      </w:sdtContent>
-    </w:sdt>
-  </w:p>
-  <w:p>
-    <w:pPr>
-      <w:tabs>
-        <w:tab w:val="center" w:pos="5400"/>
-      </w:tabs>
-      <w:rPr>
-        <w:color w:val="404040" w:themeColor="text1" w:themeTint="BF"/>
-      </w:rPr>
-    </w:pPr>
-    <w:r>
-      <w:rPr>
-        <w:noProof/>
-      </w:rPr>
-      <mc:AlternateContent>
-        <mc:Choice Requires="wps">
-          <w:drawing>
-            <wp:anchor distT="0" distB="0" distL="114300" distR="114300" simplePos="0" relativeHeight="251658243" behindDoc="0" locked="0" layoutInCell="1" allowOverlap="1" wp14:anchorId="00B35045" wp14:editId="3C686F55">
-              <wp:simplePos x="0" y="0"/>
-              <wp:positionH relativeFrom="page">
-                <wp:posOffset>9270999</wp:posOffset>
-              </wp:positionH>
-              <wp:positionV relativeFrom="page">
-                <wp:posOffset>9474200</wp:posOffset>
-              </wp:positionV>
-              <wp:extent cx="3899137" cy="451485"/>
-              <wp:effectExtent l="0" t="0" r="6350" b="5715"/>
-              <wp:wrapNone/>
-              <wp:docPr id="8" name="Text Box 8"/>
-              <wp:cNvGraphicFramePr>
-                <a:graphicFrameLocks xmlns:a="http://schemas.openxmlformats.org/drawingml/2006/main"/>
-              </wp:cNvGraphicFramePr>
-              <a:graphic xmlns:a="http://schemas.openxmlformats.org/drawingml/2006/main">
-                <a:graphicData uri="http://schemas.microsoft.com/office/word/2010/wordprocessingShape">
-                  <wps:wsp>
-                    <wps:cNvSpPr txBox="1">
-                      <a:spLocks noChangeArrowheads="1"/>
-                    </wps:cNvSpPr>
-                    <wps:spPr bwMode="auto">
-                      <a:xfrm>
-                        <a:off x="0" y="0"/>
-                        <a:ext cx="3899137" cy="451485"/>
-                      </a:xfrm>
-                      <a:prstGeom prst="rect">
-                        <a:avLst/>
-                      </a:prstGeom>
-                      <a:noFill/>
-                      <a:ln>
-                        <a:noFill/>
-                      </a:ln>
-                      <a:extLst>
-                        <a:ext uri="{909E8E84-426E-40DD-AFC4-6F175D3DCCD1}">
-                          <a14:hiddenFill xmlns:a14="http://schemas.microsoft.com/office/drawing/2010/main">
-                            <a:solidFill>
-                              <a:srgbClr val="FFFFFF"/>
-                            </a:solidFill>
-                          </a14:hiddenFill>
-                        </a:ext>
-                        <a:ext uri="{91240B29-F687-4F45-9708-019B960494DF}">
-                          <a14:hiddenLine xmlns:a14="http://schemas.microsoft.com/office/drawing/2010/main" w="9525">
-                            <a:solidFill>
-                              <a:srgbClr val="000000"/>
-                            </a:solidFill>
-                            <a:miter lim="800000"/>
-                            <a:headEnd/>
-                            <a:tailEnd/>
-                          </a14:hiddenLine>
-                        </a:ext>
-                      </a:extLst>
-                    </wps:spPr>
-                    <wps:txbx>
-                      <w:txbxContent>
-                        <w:p>
-                          <w:pPr>
-                            <w:pStyle w:val="Footer"/>
-                            <w:spacing w:after="96"/>
-                            <w:jc w:val="right"/>
-                          </w:pPr>
-                          <w:r>
-                            <w:t>Proprietary and Confidential</w:t>
-                          </w:r>
-                        </w:p>
-                      </w:txbxContent>
-                    </wps:txbx>
-                    <wps:bodyPr rot="0" vert="horz" wrap="square" lIns="0" tIns="0" rIns="0" bIns="0" anchor="t" anchorCtr="0" upright="1">
-                      <a:noAutofit/>
-                    </wps:bodyPr>
-                  </wps:wsp>
-                </a:graphicData>
-              </a:graphic>
-              <wp14:sizeRelH relativeFrom="page">
-                <wp14:pctWidth>0</wp14:pctWidth>
-              </wp14:sizeRelH>
-              <wp14:sizeRelV relativeFrom="page">
-                <wp14:pctHeight>0</wp14:pctHeight>
-              </wp14:sizeRelV>
-            </wp:anchor>
-          </w:drawing>
-        </mc:Choice>
-        <mc:Fallback>
-          <w:pict>
-            <v:shape w14:anchorId="00B35045" id="Text Box 8" o:spid="_x0000_s1032" type="#_x0000_t202" style="position:absolute;margin-left:730pt;margin-top:746pt;width:307pt;height:35.55pt;z-index:251658243;visibility:visible;mso-wrap-style:square;mso-width-percent:0;mso-height-percent:0;mso-wrap-distance-left:9pt;mso-wrap-distance-top:0;mso-wrap-distance-right:9pt;mso-wrap-distance-bottom:0;mso-position-horizontal:absolute;mso-position-horizontal-relative:page;mso-position-vertical:absolute;mso-position-vertical-relative:page;mso-width-percent:0;mso-height-percent:0;mso-width-relative:page;mso-height-relative:page;v-text-anchor:top" o:gfxdata="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" filled="f" stroked="f">
-              <v:textbox inset="0,0,0,0">
-                <w:txbxContent>
-                  <w:p>
-                    <w:pPr>
-                      <w:pStyle w:val="Footer"/>
-                      <w:spacing w:after="96"/>
-                      <w:jc w:val="right"/>
-                    </w:pPr>
-                    <w:r>
-                      <w:t>Proprietary and Confidential</w:t>
-                    </w:r>
-                  </w:p>
-                </w:txbxContent>
-              </v:textbox>
-              <w10:wrap anchorx="page" anchory="page"/>
-            </v:shape>
-          </w:pict>
-        </mc:Fallback>
-      </mc:AlternateContent>
-    </w:r>
-    <w:r>
-      <w:rPr>
-        <w:color w:val="404040" w:themeColor="text1" w:themeTint="BF"/>
-      </w:rPr>
-      <w:tab/>
-    </w:r>
-  </w:p>
-  <w:p>
-    <w:pPr>
-      <w:rPr>
-        <w:rFonts w:ascii="Lato Light" w:hAnsi="Lato Light"/>
-        <w:sz w:val="20"/>
-        <w:szCs w:val="20"/>
-      </w:rPr>
     </w:pPr>
   </w:p>
 </w:ftr>
@@ -1177,45 +991,10 @@
 <w:ftr xmlns:wpc="http://schemas.microsoft.com/office/word/2010/wordprocessingCanvas" xmlns:cx="http://schemas.microsoft.com/office/drawing/2014/chartex" xmlns:cx1="http://schemas.microsoft.com/office/drawing/2015/9/8/chartex" xmlns:cx2="http://schemas.microsoft.com/office/drawing/2015/10/21/chartex" xmlns:cx3="http://schemas.microsoft.com/office/drawing/2016/5/9/chartex" xmlns:cx4="http://schemas.microsoft.com/office/drawing/2016/5/10/chartex" xmlns:cx5="http://schemas.microsoft.com/office/drawing/2016/5/11/chartex" xmlns:cx6="http://schemas.microsoft.com/office/drawing/2016/5/12/chartex" xmlns:cx7="http://schemas.microsoft.com/office/drawing/2016/5/13/chartex" xmlns:cx8="http://schemas.microsoft.com/office/drawing/2016/5/14/chartex" xmlns:mc="http://schemas.openxmlformats.org/markup-compatibility/2006" xmlns:aink="http://schemas.microsoft.com/office/drawing/2016/ink" xmlns:am3d="http://schemas.microsoft.com/office/drawing/2017/model3d" xmlns:o="urn:schemas-microsoft-com:office:office" xmlns:oel="http://schemas.microsoft.com/office/2019/extlst" xmlns:r="http://schemas.openxmlformats.org/officeDocument/2006/relationships" xmlns:m="http://schemas.openxmlformats.org/officeDocument/2006/math" xmlns:v="urn:schemas-microsoft-com:vml" xmlns:wp14="http://schemas.microsoft.com/office/word/2010/wordprocessingDrawing" xmlns:wp="http://schemas.openxmlformats.org/drawingml/2006/wordprocessingDrawing" xmlns:w10="urn:schemas-microsoft-com:office:word" xmlns:w="http://schemas.openxmlformats.org/wordprocessingml/2006/main" xmlns:w14="http://schemas.microsoft.com/office/word/2010/wordml" xmlns:w15="http://schemas.microsoft.com/office/word/2012/wordml" xmlns:w16cex="http://schemas.microsoft.com/office/word/2018/wordml/cex" xmlns:w16cid="http://schemas.microsoft.com/office/word/2016/wordml/cid" xmlns:w16="http://schemas.microsoft.com/office/word/2018/wordml" xmlns:w16du="http://schemas.microsoft.com/office/word/2023/wordml/word16du" xmlns:w16sdtdh="http://schemas.microsoft.com/office/word/2020/wordml/sdtdatahash" xmlns:w16sdtfl="http://schemas.microsoft.com/office/word/2024/wordml/sdtformatlock" xmlns:w16se="http://schemas.microsoft.com/office/word/2015/wordml/symex" xmlns:wpg="http://schemas.microsoft.com/office/word/2010/wordprocessingGroup" xmlns:wpi="http://schemas.microsoft.com/office/word/2010/wordprocessingInk" xmlns:wne="http://schemas.microsoft.com/office/word/2006/wordml" xmlns:wps="http://schemas.microsoft.com/office/word/2010/wordprocessingShape" mc:Ignorable="w14 w15 w16se w16cid w16 w16cex w16sdtdh w16sdtfl w16du wp14">
   <w:p>
     <w:pPr>
-      <w:rPr>
-        <w:rStyle w:val="PageNumber"/>
-      </w:rPr>
-    </w:pPr>
-    <w:r>
-      <w:rPr>
-        <w:rStyle w:val="PageNumber"/>
-      </w:rPr>
-      <w:fldChar w:fldCharType="begin"/>
-    </w:r>
-    <w:r>
-      <w:rPr>
-        <w:rStyle w:val="PageNumber"/>
-      </w:rPr>
-      <w:instrText xml:space="preserve">PAGE  </w:instrText>
-    </w:r>
-    <w:r>
-      <w:rPr>
-        <w:rStyle w:val="PageNumber"/>
-      </w:rPr>
-      <w:fldChar w:fldCharType="separate"/>
-    </w:r>
-    <w:r>
-      <w:rPr>
-        <w:rStyle w:val="PageNumber"/>
-        <w:noProof/>
-      </w:rPr>
-      <w:t>2</w:t>
-    </w:r>
-    <w:r>
-      <w:rPr>
-        <w:rStyle w:val="PageNumber"/>
-      </w:rPr>
-      <w:fldChar w:fldCharType="end"/>
-    </w:r>
+      <w:pStyle w:val="Footer"/>
+      <w:spacing w:after="96"/>
+    </w:pPr>
   </w:p>
-  <w:p/>
-  <w:p/>
-  <w:p/>
 </w:ftr>
 </file>
 
@@ -1264,79 +1043,92 @@
 
 <file path=word/header2.xml><?xml version="1.0" encoding="utf-8"?>
 <w:hdr xmlns:wpc="http://schemas.microsoft.com/office/word/2010/wordprocessingCanvas" xmlns:cx="http://schemas.microsoft.com/office/drawing/2014/chartex" xmlns:cx1="http://schemas.microsoft.com/office/drawing/2015/9/8/chartex" xmlns:cx2="http://schemas.microsoft.com/office/drawing/2015/10/21/chartex" xmlns:cx3="http://schemas.microsoft.com/office/drawing/2016/5/9/chartex" xmlns:cx4="http://schemas.microsoft.com/office/drawing/2016/5/10/chartex" xmlns:cx5="http://schemas.microsoft.com/office/drawing/2016/5/11/chartex" xmlns:cx6="http://schemas.microsoft.com/office/drawing/2016/5/12/chartex" xmlns:cx7="http://schemas.microsoft.com/office/drawing/2016/5/13/chartex" xmlns:cx8="http://schemas.microsoft.com/office/drawing/2016/5/14/chartex" xmlns:mc="http://schemas.openxmlformats.org/markup-compatibility/2006" xmlns:aink="http://schemas.microsoft.com/office/drawing/2016/ink" xmlns:am3d="http://schemas.microsoft.com/office/drawing/2017/model3d" xmlns:o="urn:schemas-microsoft-com:office:office" xmlns:oel="http://schemas.microsoft.com/office/2019/extlst" xmlns:r="http://schemas.openxmlformats.org/officeDocument/2006/relationships" xmlns:m="http://schemas.openxmlformats.org/officeDocument/2006/math" xmlns:v="urn:schemas-microsoft-com:vml" xmlns:wp14="http://schemas.microsoft.com/office/word/2010/wordprocessingDrawing" xmlns:wp="http://schemas.openxmlformats.org/drawingml/2006/wordprocessingDrawing" xmlns:w10="urn:schemas-microsoft-com:office:word" xmlns:w="http://schemas.openxmlformats.org/wordprocessingml/2006/main" xmlns:w14="http://schemas.microsoft.com/office/word/2010/wordml" xmlns:w15="http://schemas.microsoft.com/office/word/2012/wordml" xmlns:w16cex="http://schemas.microsoft.com/office/word/2018/wordml/cex" xmlns:w16cid="http://schemas.microsoft.com/office/word/2016/wordml/cid" xmlns:w16="http://schemas.microsoft.com/office/word/2018/wordml" xmlns:w16du="http://schemas.microsoft.com/office/word/2023/wordml/word16du" xmlns:w16sdtdh="http://schemas.microsoft.com/office/word/2020/wordml/sdtdatahash" xmlns:w16sdtfl="http://schemas.microsoft.com/office/word/2024/wordml/sdtformatlock" xmlns:w16se="http://schemas.microsoft.com/office/word/2015/wordml/symex" xmlns:wpg="http://schemas.microsoft.com/office/word/2010/wordprocessingGroup" xmlns:wpi="http://schemas.microsoft.com/office/word/2010/wordprocessingInk" xmlns:wne="http://schemas.microsoft.com/office/word/2006/wordml" xmlns:wps="http://schemas.microsoft.com/office/word/2010/wordprocessingShape" mc:Ignorable="w14 w15 w16se w16cid w16 w16cex w16sdtdh w16sdtfl w16du wp14">
-  <w:p/>
   <w:p>
-    <w:r>
-      <w:rPr>
-        <w:noProof/>
-      </w:rPr>
-      <w:drawing>
-        <wp:anchor distT="0" distB="0" distL="114300" distR="114300" simplePos="0" relativeHeight="251667459" behindDoc="0" locked="0" layoutInCell="1" allowOverlap="1" wp14:anchorId="1DF569F6" wp14:editId="1437FB4A">
-          <wp:simplePos x="0" y="0"/>
-          <wp:positionH relativeFrom="margin">
-            <wp:posOffset>-146050</wp:posOffset>
-          </wp:positionH>
-          <wp:positionV relativeFrom="page">
-            <wp:posOffset>349250</wp:posOffset>
-          </wp:positionV>
-          <wp:extent cx="2185670" cy="539750"/>
-          <wp:effectExtent l="0" t="0" r="0" b="0"/>
-          <wp:wrapNone/>
-          <wp:docPr id="10" name="Picture 10"/>
-          <wp:cNvGraphicFramePr>
-            <a:graphicFrameLocks xmlns:a="http://schemas.openxmlformats.org/drawingml/2006/main" noChangeAspect="1"/>
-          </wp:cNvGraphicFramePr>
-          <a:graphic xmlns:a="http://schemas.openxmlformats.org/drawingml/2006/main">
-            <a:graphicData uri="http://schemas.openxmlformats.org/drawingml/2006/picture">
-              <pic:pic xmlns:pic="http://schemas.openxmlformats.org/drawingml/2006/picture">
-                <pic:nvPicPr>
-                  <pic:cNvPr id="10" name="Picture 10"/>
-                  <pic:cNvPicPr>
-                    <a:picLocks noChangeAspect="1" noChangeArrowheads="1"/>
-                  </pic:cNvPicPr>
-                </pic:nvPicPr>
-                <pic:blipFill>
-                  <a:blip r:embed="rId1"/>
-                  <a:srcRect t="8939" b="8939"/>
-                  <a:stretch>
-                    <a:fillRect/>
-                  </a:stretch>
-                </pic:blipFill>
-                <pic:spPr bwMode="auto">
-                  <a:xfrm>
-                    <a:off x="0" y="0"/>
-                    <a:ext cx="2185670" cy="539750"/>
-                  </a:xfrm>
-                  <a:prstGeom prst="rect">
-                    <a:avLst/>
-                  </a:prstGeom>
-                  <a:noFill/>
-                  <a:ln>
+    <w:pPr>
+      <w:pStyle w:val="Header"/>
+      <w:spacing w:after="96"/>
+      <w:rPr>
+        <w:ins w:id="0" w:author="Cristian Badaracco" w:date="2026-06-12T13:05:00Z" w16du:dateUtc="2026-06-12T16:05:00Z"/>
+      </w:rPr>
+    </w:pPr>
+    <w:ins w:id="1" w:author="Cristian Badaracco" w:date="2026-06-12T13:05:00Z" w16du:dateUtc="2026-06-12T16:05:00Z">
+      <w:r>
+        <w:rPr>
+          <w:noProof/>
+        </w:rPr>
+        <w:drawing>
+          <wp:anchor distT="0" distB="0" distL="114300" distR="114300" simplePos="0" relativeHeight="251659264" behindDoc="0" locked="0" layoutInCell="1" allowOverlap="1" wp14:anchorId="37C90F69" wp14:editId="704B039B">
+            <wp:simplePos x="0" y="0"/>
+            <wp:positionH relativeFrom="margin">
+              <wp:posOffset>-158750</wp:posOffset>
+            </wp:positionH>
+            <wp:positionV relativeFrom="page">
+              <wp:posOffset>381000</wp:posOffset>
+            </wp:positionV>
+            <wp:extent cx="2185670" cy="539750"/>
+            <wp:effectExtent l="0" t="0" r="0" b="0"/>
+            <wp:wrapNone/>
+            <wp:docPr id="2041446420" name="Picture 2041446420"/>
+            <wp:cNvGraphicFramePr>
+              <a:graphicFrameLocks xmlns:a="http://schemas.openxmlformats.org/drawingml/2006/main" noChangeAspect="1"/>
+            </wp:cNvGraphicFramePr>
+            <a:graphic xmlns:a="http://schemas.openxmlformats.org/drawingml/2006/main">
+              <a:graphicData uri="http://schemas.openxmlformats.org/drawingml/2006/picture">
+                <pic:pic xmlns:pic="http://schemas.openxmlformats.org/drawingml/2006/picture">
+                  <pic:nvPicPr>
+                    <pic:cNvPr id="10" name="Picture 10"/>
+                    <pic:cNvPicPr>
+                      <a:picLocks noChangeAspect="1" noChangeArrowheads="1"/>
+                    </pic:cNvPicPr>
+                  </pic:nvPicPr>
+                  <pic:blipFill>
+                    <a:blip r:embed="rId1"/>
+                    <a:srcRect t="8939" b="8939"/>
+                    <a:stretch>
+                      <a:fillRect/>
+                    </a:stretch>
+                  </pic:blipFill>
+                  <pic:spPr bwMode="auto">
+                    <a:xfrm>
+                      <a:off x="0" y="0"/>
+                      <a:ext cx="2185670" cy="539750"/>
+                    </a:xfrm>
+                    <a:prstGeom prst="rect">
+                      <a:avLst/>
+                    </a:prstGeom>
                     <a:noFill/>
-                  </a:ln>
-                  <a:extLst>
-                    <a:ext uri="{53640926-AAD7-44D8-BBD7-CCE9431645EC}">
-                      <a14:shadowObscured xmlns:a14="http://schemas.microsoft.com/office/drawing/2010/main"/>
-                    </a:ext>
-                    <a:ext uri="{FAA26D3D-D897-4be2-8F04-BA451C77F1D7}">
-                      <ma14:placeholderFlag xmlns:a16="http://schemas.microsoft.com/office/drawing/2014/main" xmlns:arto="http://schemas.microsoft.com/office/word/2006/arto" xmlns:ma14="http://schemas.microsoft.com/office/mac/drawingml/2011/main" xmlns:w="http://schemas.openxmlformats.org/wordprocessingml/2006/main" xmlns:w10="urn:schemas-microsoft-com:office:word" xmlns:v="urn:schemas-microsoft-com:vml" xmlns:o="urn:schemas-microsoft-com:office:office" xmlns:mv="urn:schemas-microsoft-com:mac:vml" xmlns:mo="http://schemas.microsoft.com/office/mac/office/2008/main" xmlns="" xmlns:asvg="http://schemas.microsoft.com/office/drawing/2016/SVG/main" xmlns:a14="http://schemas.microsoft.com/office/drawing/2010/main"/>
-                    </a:ext>
-                  </a:extLst>
-                </pic:spPr>
-              </pic:pic>
-            </a:graphicData>
-          </a:graphic>
-          <wp14:sizeRelH relativeFrom="page">
-            <wp14:pctWidth>0</wp14:pctWidth>
-          </wp14:sizeRelH>
-          <wp14:sizeRelV relativeFrom="page">
-            <wp14:pctHeight>0</wp14:pctHeight>
-          </wp14:sizeRelV>
-        </wp:anchor>
-      </w:drawing>
-    </w:r>
+                    <a:ln>
+                      <a:noFill/>
+                    </a:ln>
+                    <a:extLst>
+                      <a:ext uri="{53640926-AAD7-44D8-BBD7-CCE9431645EC}">
+                        <a14:shadowObscured xmlns:a14="http://schemas.microsoft.com/office/drawing/2010/main"/>
+                      </a:ext>
+                      <a:ext uri="{FAA26D3D-D897-4be2-8F04-BA451C77F1D7}">
+                        <ma14:placeholderFlag xmlns:a16="http://schemas.microsoft.com/office/drawing/2014/main" xmlns:arto="http://schemas.microsoft.com/office/word/2006/arto" xmlns:ma14="http://schemas.microsoft.com/office/mac/drawingml/2011/main" xmlns:w="http://schemas.openxmlformats.org/wordprocessingml/2006/main" xmlns:w10="urn:schemas-microsoft-com:office:word" xmlns:v="urn:schemas-microsoft-com:vml" xmlns:o="urn:schemas-microsoft-com:office:office" xmlns:mv="urn:schemas-microsoft-com:mac:vml" xmlns:mo="http://schemas.microsoft.com/office/mac/office/2008/main" xmlns="" xmlns:asvg="http://schemas.microsoft.com/office/drawing/2016/SVG/main" xmlns:a14="http://schemas.microsoft.com/office/drawing/2010/main"/>
+                      </a:ext>
+                    </a:extLst>
+                  </pic:spPr>
+                </pic:pic>
+              </a:graphicData>
+            </a:graphic>
+            <wp14:sizeRelH relativeFrom="page">
+              <wp14:pctWidth>0</wp14:pctWidth>
+            </wp14:sizeRelH>
+            <wp14:sizeRelV relativeFrom="page">
+              <wp14:pctHeight>0</wp14:pctHeight>
+            </wp14:sizeRelV>
+          </wp:anchor>
+        </w:drawing>
+      </w:r>
+    </w:ins>
   </w:p>
-  <w:p/>
+  <w:p>
+    <w:pPr>
+      <w:pStyle w:val="Header"/>
+      <w:spacing w:after="96"/>
+    </w:pPr>
+  </w:p>
 </w:hdr>
 </file>
 
@@ -1376,8 +1168,8 @@
       </w:pPr>
       <w:rPr>
         <w:rFonts w:ascii="Courier New" w:hAnsi="Courier New" w:cs="Courier New" w:hint="default"/>
-        <w:color w:val="CC1F20" w:themeColor="text2"/>
-        <w:u w:color="CC1F20" w:themeColor="text2"/>
+        <w:color w:val="212745" w:themeColor="text2"/>
+        <w:u w:color="212745" w:themeColor="text2"/>
       </w:rPr>
     </w:lvl>
     <w:lvl w:ilvl="1" w:tplc="FFFFFFFF">
@@ -1492,7 +1284,7 @@
       </w:pPr>
       <w:rPr>
         <w:rFonts w:ascii="Lato" w:hAnsi="Lato" w:hint="default"/>
-        <w:color w:val="CC1F20" w:themeColor="text2"/>
+        <w:color w:val="212745" w:themeColor="text2"/>
         <w:sz w:val="20"/>
       </w:rPr>
     </w:lvl>
@@ -1607,7 +1399,7 @@
       </w:pPr>
       <w:rPr>
         <w:rFonts w:ascii="Lato" w:hAnsi="Lato" w:hint="default"/>
-        <w:color w:val="CC1F20" w:themeColor="text2"/>
+        <w:color w:val="212745" w:themeColor="text2"/>
         <w:sz w:val="20"/>
       </w:rPr>
     </w:lvl>
@@ -1723,7 +1515,7 @@
       </w:pPr>
       <w:rPr>
         <w:rFonts w:ascii="Symbol" w:hAnsi="Symbol" w:hint="default"/>
-        <w:color w:val="CC1F20" w:themeColor="text2"/>
+        <w:color w:val="212745" w:themeColor="text2"/>
       </w:rPr>
     </w:lvl>
     <w:lvl w:ilvl="1" w:tplc="04090003" w:tentative="1">
@@ -1837,7 +1629,7 @@
       </w:pPr>
       <w:rPr>
         <w:rFonts w:ascii="Lato" w:hAnsi="Lato" w:hint="default"/>
-        <w:color w:val="CC1F20" w:themeColor="text2"/>
+        <w:color w:val="212745" w:themeColor="text2"/>
         <w:sz w:val="20"/>
       </w:rPr>
     </w:lvl>
@@ -2066,7 +1858,7 @@
       </w:pPr>
       <w:rPr>
         <w:rFonts w:asciiTheme="minorHAnsi" w:hAnsiTheme="minorHAnsi" w:hint="default"/>
-        <w:color w:val="CC1F20" w:themeColor="text2"/>
+        <w:color w:val="212745" w:themeColor="text2"/>
       </w:rPr>
     </w:lvl>
     <w:lvl w:ilvl="1" w:tplc="04090019" w:tentative="1">
@@ -2383,8 +2175,8 @@
       </w:pPr>
       <w:rPr>
         <w:rFonts w:asciiTheme="minorHAnsi" w:hAnsiTheme="minorHAnsi" w:hint="default"/>
-        <w:color w:val="CC1F20" w:themeColor="text2"/>
-        <w:u w:color="CC1F20" w:themeColor="text2"/>
+        <w:color w:val="212745" w:themeColor="text2"/>
+        <w:u w:color="212745" w:themeColor="text2"/>
       </w:rPr>
     </w:lvl>
     <w:lvl w:ilvl="1" w:tplc="FFFFFFFF">
@@ -2498,7 +2290,7 @@
       </w:pPr>
       <w:rPr>
         <w:rFonts w:ascii="Lato" w:hAnsi="Lato" w:hint="default"/>
-        <w:color w:val="CC1F20" w:themeColor="text2"/>
+        <w:color w:val="212745" w:themeColor="text2"/>
         <w:sz w:val="20"/>
       </w:rPr>
     </w:lvl>
@@ -2613,7 +2405,7 @@
       </w:pPr>
       <w:rPr>
         <w:rFonts w:ascii="Symbol" w:hAnsi="Symbol" w:hint="default"/>
-        <w:color w:val="CC1F20" w:themeColor="text2"/>
+        <w:color w:val="212745" w:themeColor="text2"/>
         <w:sz w:val="18"/>
       </w:rPr>
     </w:lvl>
@@ -2842,7 +2634,7 @@
       </w:pPr>
       <w:rPr>
         <w:rFonts w:asciiTheme="minorHAnsi" w:hAnsiTheme="minorHAnsi" w:hint="default"/>
-        <w:color w:val="CC1F20" w:themeColor="text2"/>
+        <w:color w:val="212745" w:themeColor="text2"/>
       </w:rPr>
     </w:lvl>
     <w:lvl w:ilvl="1" w:tplc="04090019" w:tentative="1">
@@ -3073,11 +2865,11 @@
       </w:pPr>
       <w:rPr>
         <w:rFonts w:ascii="Symbol" w:hAnsi="Symbol" w:hint="default"/>
-        <w:color w:val="CC1F20" w:themeColor="text2"/>
+        <w:color w:val="212745" w:themeColor="text2"/>
         <w:spacing w:val="0"/>
         <w:w w:val="100"/>
         <w:position w:val="0"/>
-        <w:u w:color="CC1F20" w:themeColor="text2"/>
+        <w:u w:color="212745" w:themeColor="text2"/>
         <w14:ligatures w14:val="none"/>
         <w14:numSpacing w14:val="default"/>
       </w:rPr>
@@ -3193,7 +2985,7 @@
       </w:pPr>
       <w:rPr>
         <w:rFonts w:ascii="Arial" w:hAnsi="Arial" w:hint="default"/>
-        <w:color w:val="CC1F20" w:themeColor="text2"/>
+        <w:color w:val="212745" w:themeColor="text2"/>
         <w:spacing w:val="0"/>
         <w:w w:val="100"/>
         <w:position w:val="0"/>
@@ -3288,7 +3080,7 @@
       </w:pPr>
       <w:rPr>
         <w:rFonts w:ascii="Arial" w:hAnsi="Arial" w:hint="default"/>
-        <w:color w:val="CC1F20" w:themeColor="text2"/>
+        <w:color w:val="212745" w:themeColor="text2"/>
         <w:spacing w:val="0"/>
         <w:w w:val="100"/>
         <w:position w:val="0"/>
@@ -3306,7 +3098,7 @@
       </w:pPr>
       <w:rPr>
         <w:rFonts w:asciiTheme="minorHAnsi" w:hAnsiTheme="minorHAnsi" w:hint="default"/>
-        <w:color w:val="CC1F20" w:themeColor="text2"/>
+        <w:color w:val="212745" w:themeColor="text2"/>
       </w:rPr>
     </w:lvl>
     <w:lvl w:ilvl="2" w:tplc="FFFFFFFF">
@@ -3521,7 +3313,7 @@
       </w:pPr>
       <w:rPr>
         <w:rFonts w:ascii="Lato" w:hAnsi="Lato" w:hint="default"/>
-        <w:color w:val="CC1F20" w:themeColor="text2"/>
+        <w:color w:val="212745" w:themeColor="text2"/>
         <w:sz w:val="20"/>
       </w:rPr>
     </w:lvl>
@@ -3752,7 +3544,7 @@
       <w:rPr>
         <w:rFonts w:ascii="Wingdings" w:hAnsi="Wingdings" w:hint="default"/>
         <w:color w:val="auto"/>
-        <w:u w:color="CC1F20" w:themeColor="text2"/>
+        <w:u w:color="212745" w:themeColor="text2"/>
       </w:rPr>
     </w:lvl>
     <w:lvl w:ilvl="1" w:tplc="38A8127E">
@@ -3867,7 +3659,7 @@
       </w:pPr>
       <w:rPr>
         <w:rFonts w:ascii="Lato" w:hAnsi="Lato" w:hint="default"/>
-        <w:color w:val="CC1F20" w:themeColor="text2"/>
+        <w:color w:val="212745" w:themeColor="text2"/>
         <w:sz w:val="20"/>
       </w:rPr>
     </w:lvl>
@@ -3982,7 +3774,7 @@
       </w:pPr>
       <w:rPr>
         <w:rFonts w:ascii="Symbol" w:hAnsi="Symbol" w:hint="default"/>
-        <w:color w:val="CC1F20" w:themeColor="text2"/>
+        <w:color w:val="212745" w:themeColor="text2"/>
         <w:sz w:val="18"/>
       </w:rPr>
     </w:lvl>
@@ -4098,7 +3890,7 @@
       </w:pPr>
       <w:rPr>
         <w:rFonts w:ascii="Arial" w:hAnsi="Arial" w:hint="default"/>
-        <w:color w:val="CC1F20" w:themeColor="text2"/>
+        <w:color w:val="212745" w:themeColor="text2"/>
         <w:spacing w:val="0"/>
         <w:w w:val="100"/>
         <w:position w:val="0"/>
@@ -4193,7 +3985,7 @@
       </w:pPr>
       <w:rPr>
         <w:rFonts w:ascii="Arial" w:hAnsi="Arial" w:hint="default"/>
-        <w:color w:val="CC1F20" w:themeColor="text2"/>
+        <w:color w:val="212745" w:themeColor="text2"/>
         <w:spacing w:val="0"/>
         <w:w w:val="100"/>
         <w:position w:val="0"/>
@@ -4381,6 +4173,14 @@
   </w:num>
   <w:numIdMacAtCleanup w:val="13"/>
 </w:numbering>
+</file>
+
+<file path=word/people.xml><?xml version="1.0" encoding="utf-8"?>
+<w15:people xmlns:wpc="http://schemas.microsoft.com/office/word/2010/wordprocessingCanvas" xmlns:cx="http://schemas.microsoft.com/office/drawing/2014/chartex" xmlns:cx1="http://schemas.microsoft.com/office/drawing/2015/9/8/chartex" xmlns:cx2="http://schemas.microsoft.com/office/drawing/2015/10/21/chartex" xmlns:cx3="http://schemas.microsoft.com/office/drawing/2016/5/9/chartex" xmlns:cx4="http://schemas.microsoft.com/office/drawing/2016/5/10/chartex" xmlns:cx5="http://schemas.microsoft.com/office/drawing/2016/5/11/chartex" xmlns:cx6="http://schemas.microsoft.com/office/drawing/2016/5/12/chartex" xmlns:cx7="http://schemas.microsoft.com/office/drawing/2016/5/13/chartex" xmlns:cx8="http://schemas.microsoft.com/office/drawing/2016/5/14/chartex" xmlns:mc="http://schemas.openxmlformats.org/markup-compatibility/2006" xmlns:aink="http://schemas.microsoft.com/office/drawing/2016/ink" xmlns:am3d="http://schemas.microsoft.com/office/drawing/2017/model3d" xmlns:o="urn:schemas-microsoft-com:office:office" xmlns:oel="http://schemas.microsoft.com/office/2019/extlst" xmlns:r="http://schemas.openxmlformats.org/officeDocument/2006/relationships" xmlns:m="http://schemas.openxmlformats.org/officeDocument/2006/math" xmlns:v="urn:schemas-microsoft-com:vml" xmlns:wp14="http://schemas.microsoft.com/office/word/2010/wordprocessingDrawing" xmlns:wp="http://schemas.openxmlformats.org/drawingml/2006/wordprocessingDrawing" xmlns:w10="urn:schemas-microsoft-com:office:word" xmlns:w="http://schemas.openxmlformats.org/wordprocessingml/2006/main" xmlns:w14="http://schemas.microsoft.com/office/word/2010/wordml" xmlns:w15="http://schemas.microsoft.com/office/word/2012/wordml" xmlns:w16cex="http://schemas.microsoft.com/office/word/2018/wordml/cex" xmlns:w16cid="http://schemas.microsoft.com/office/word/2016/wordml/cid" xmlns:w16="http://schemas.microsoft.com/office/word/2018/wordml" xmlns:w16du="http://schemas.microsoft.com/office/word/2023/wordml/word16du" xmlns:w16sdtdh="http://schemas.microsoft.com/office/word/2020/wordml/sdtdatahash" xmlns:w16sdtfl="http://schemas.microsoft.com/office/word/2024/wordml/sdtformatlock" xmlns:w16se="http://schemas.microsoft.com/office/word/2015/wordml/symex" xmlns:wpg="http://schemas.microsoft.com/office/word/2010/wordprocessingGroup" xmlns:wpi="http://schemas.microsoft.com/office/word/2010/wordprocessingInk" xmlns:wne="http://schemas.microsoft.com/office/word/2006/wordml" xmlns:wps="http://schemas.microsoft.com/office/word/2010/wordprocessingShape" mc:Ignorable="w14 w15 w16se w16cid w16 w16cex w16sdtdh w16sdtfl w16du wp14">
+  <w15:person w15:author="Cristian Badaracco">
+    <w15:presenceInfo w15:providerId="AD" w15:userId="S::cristian.badaracco@perficient.com::c7077fe4-e3b0-4f53-9b6a-1ca9094ecd11"/>
+  </w15:person>
+</w15:people>
 </file>
 
 <file path=word/styles.xml><?xml version="1.0" encoding="utf-8"?>
@@ -4856,7 +4656,7 @@
       <w:rFonts w:asciiTheme="majorHAnsi" w:eastAsiaTheme="majorEastAsia" w:hAnsiTheme="majorHAnsi"/>
       <w:b/>
       <w:bCs/>
-      <w:color w:val="CC1F20" w:themeColor="text2"/>
+      <w:color w:val="212745" w:themeColor="text2"/>
       <w:sz w:val="28"/>
       <w:szCs w:val="32"/>
     </w:rPr>
@@ -4903,7 +4703,7 @@
       <w:rFonts w:asciiTheme="majorHAnsi" w:eastAsiaTheme="majorEastAsia" w:hAnsiTheme="majorHAnsi"/>
       <w:b/>
       <w:bCs/>
-      <w:color w:val="DE2728" w:themeColor="text2" w:themeTint="E6"/>
+      <w:color w:val="2E3660" w:themeColor="text2" w:themeTint="E6"/>
       <w:sz w:val="24"/>
     </w:rPr>
   </w:style>
@@ -4968,7 +4768,7 @@
     </w:pPr>
     <w:rPr>
       <w:rFonts w:asciiTheme="majorHAnsi" w:eastAsiaTheme="majorEastAsia" w:hAnsiTheme="majorHAnsi" w:cstheme="majorBidi"/>
-      <w:color w:val="8D0E11" w:themeColor="accent1"/>
+      <w:color w:val="4E67C8" w:themeColor="accent1"/>
       <w:sz w:val="20"/>
       <w:szCs w:val="20"/>
     </w:rPr>
@@ -5048,7 +4848,7 @@
     <w:rPr>
       <w:rFonts w:asciiTheme="majorHAnsi" w:eastAsiaTheme="majorEastAsia" w:hAnsiTheme="majorHAnsi" w:cs="Arial"/>
       <w:b/>
-      <w:color w:val="010101" w:themeColor="text1"/>
+      <w:color w:val="000000" w:themeColor="text1"/>
       <w:sz w:val="32"/>
       <w:szCs w:val="32"/>
     </w:rPr>
@@ -5063,7 +4863,7 @@
       <w:rFonts w:asciiTheme="majorHAnsi" w:eastAsiaTheme="majorEastAsia" w:hAnsiTheme="majorHAnsi" w:cs="Arial"/>
       <w:b/>
       <w:bCs/>
-      <w:color w:val="CC1F20" w:themeColor="text2"/>
+      <w:color w:val="212745" w:themeColor="text2"/>
       <w:sz w:val="28"/>
       <w:szCs w:val="32"/>
     </w:rPr>
@@ -5077,7 +4877,7 @@
     <w:rPr>
       <w:rFonts w:asciiTheme="majorHAnsi" w:eastAsiaTheme="majorEastAsia" w:hAnsiTheme="majorHAnsi" w:cs="Arial"/>
       <w:b/>
-      <w:color w:val="010101" w:themeColor="text1"/>
+      <w:color w:val="000000" w:themeColor="text1"/>
       <w:sz w:val="28"/>
       <w:szCs w:val="28"/>
     </w:rPr>
@@ -5092,7 +4892,7 @@
       <w:rFonts w:asciiTheme="majorHAnsi" w:eastAsiaTheme="majorEastAsia" w:hAnsiTheme="majorHAnsi" w:cs="Arial"/>
       <w:b/>
       <w:bCs/>
-      <w:color w:val="DE2728" w:themeColor="text2" w:themeTint="E6"/>
+      <w:color w:val="2E3660" w:themeColor="text2" w:themeTint="E6"/>
       <w:sz w:val="24"/>
       <w:szCs w:val="24"/>
     </w:rPr>
@@ -5135,7 +4935,7 @@
     <w:rsid w:val="008A6D1A"/>
     <w:rPr>
       <w:rFonts w:asciiTheme="majorHAnsi" w:eastAsiaTheme="majorEastAsia" w:hAnsiTheme="majorHAnsi" w:cstheme="majorBidi"/>
-      <w:color w:val="8D0E11" w:themeColor="accent1"/>
+      <w:color w:val="4E67C8" w:themeColor="accent1"/>
       <w:sz w:val="20"/>
       <w:szCs w:val="20"/>
     </w:rPr>
@@ -5167,7 +4967,7 @@
     <w:rPr>
       <w:b/>
       <w:bCs/>
-      <w:color w:val="8D0E11" w:themeColor="accent1"/>
+      <w:color w:val="4E67C8" w:themeColor="accent1"/>
       <w:sz w:val="18"/>
       <w:szCs w:val="18"/>
     </w:rPr>
@@ -5188,7 +4988,7 @@
       <w:rFonts w:asciiTheme="majorHAnsi" w:eastAsiaTheme="majorEastAsia" w:hAnsiTheme="majorHAnsi" w:cs="Arial"/>
       <w:b/>
       <w:bCs/>
-      <w:color w:val="CC1F20" w:themeColor="text2"/>
+      <w:color w:val="212745" w:themeColor="text2"/>
       <w:sz w:val="56"/>
       <w:szCs w:val="56"/>
     </w:rPr>
@@ -5239,7 +5039,7 @@
     <w:rPr>
       <w:rFonts w:cs="Arial"/>
       <w:noProof/>
-      <w:color w:val="010101" w:themeColor="text1"/>
+      <w:color w:val="000000" w:themeColor="text1"/>
       <w:szCs w:val="22"/>
     </w:rPr>
   </w:style>
@@ -5260,7 +5060,7 @@
     <w:rPr>
       <w:rFonts w:cs="Arial"/>
       <w:noProof/>
-      <w:color w:val="010101" w:themeColor="text1"/>
+      <w:color w:val="000000" w:themeColor="text1"/>
       <w:sz w:val="24"/>
     </w:rPr>
   </w:style>
@@ -5282,7 +5082,7 @@
     <w:rPr>
       <w:rFonts w:cs="Arial"/>
       <w:noProof/>
-      <w:color w:val="010101" w:themeColor="text1"/>
+      <w:color w:val="000000" w:themeColor="text1"/>
       <w:szCs w:val="22"/>
     </w:rPr>
   </w:style>
@@ -5304,7 +5104,7 @@
     <w:rPr>
       <w:rFonts w:cs="Arial"/>
       <w:noProof/>
-      <w:color w:val="010101" w:themeColor="text1"/>
+      <w:color w:val="000000" w:themeColor="text1"/>
       <w:sz w:val="20"/>
       <w:szCs w:val="20"/>
     </w:rPr>
@@ -5428,7 +5228,7 @@
     <w:unhideWhenUsed/>
     <w:rsid w:val="003C4634"/>
     <w:rPr>
-      <w:color w:val="CC1F20" w:themeColor="hyperlink"/>
+      <w:color w:val="56C7AA" w:themeColor="hyperlink"/>
       <w:u w:val="single"/>
     </w:rPr>
   </w:style>
@@ -5462,10 +5262,10 @@
       <w:tblStyleRowBandSize w:val="1"/>
       <w:tblStyleColBandSize w:val="1"/>
       <w:tblBorders>
-        <w:top w:val="single" w:sz="8" w:space="0" w:color="8C734B" w:themeColor="accent2"/>
-        <w:left w:val="single" w:sz="8" w:space="0" w:color="8C734B" w:themeColor="accent2"/>
-        <w:bottom w:val="single" w:sz="8" w:space="0" w:color="8C734B" w:themeColor="accent2"/>
-        <w:right w:val="single" w:sz="8" w:space="0" w:color="8C734B" w:themeColor="accent2"/>
+        <w:top w:val="single" w:sz="8" w:space="0" w:color="5ECCF3" w:themeColor="accent2"/>
+        <w:left w:val="single" w:sz="8" w:space="0" w:color="5ECCF3" w:themeColor="accent2"/>
+        <w:bottom w:val="single" w:sz="8" w:space="0" w:color="5ECCF3" w:themeColor="accent2"/>
+        <w:right w:val="single" w:sz="8" w:space="0" w:color="5ECCF3" w:themeColor="accent2"/>
       </w:tblBorders>
     </w:tblPr>
     <w:tblStylePr w:type="firstRow">
@@ -5479,7 +5279,7 @@
       </w:rPr>
       <w:tblPr/>
       <w:tcPr>
-        <w:shd w:val="clear" w:color="auto" w:fill="8C734B" w:themeFill="accent2"/>
+        <w:shd w:val="clear" w:color="auto" w:fill="5ECCF3" w:themeFill="accent2"/>
       </w:tcPr>
     </w:tblStylePr>
     <w:tblStylePr w:type="lastRow">
@@ -5493,10 +5293,10 @@
       <w:tblPr/>
       <w:tcPr>
         <w:tcBorders>
-          <w:top w:val="double" w:sz="6" w:space="0" w:color="8C734B" w:themeColor="accent2"/>
-          <w:left w:val="single" w:sz="8" w:space="0" w:color="8C734B" w:themeColor="accent2"/>
-          <w:bottom w:val="single" w:sz="8" w:space="0" w:color="8C734B" w:themeColor="accent2"/>
-          <w:right w:val="single" w:sz="8" w:space="0" w:color="8C734B" w:themeColor="accent2"/>
+          <w:top w:val="double" w:sz="6" w:space="0" w:color="5ECCF3" w:themeColor="accent2"/>
+          <w:left w:val="single" w:sz="8" w:space="0" w:color="5ECCF3" w:themeColor="accent2"/>
+          <w:bottom w:val="single" w:sz="8" w:space="0" w:color="5ECCF3" w:themeColor="accent2"/>
+          <w:right w:val="single" w:sz="8" w:space="0" w:color="5ECCF3" w:themeColor="accent2"/>
         </w:tcBorders>
       </w:tcPr>
     </w:tblStylePr>
@@ -5516,10 +5316,10 @@
       <w:tblPr/>
       <w:tcPr>
         <w:tcBorders>
-          <w:top w:val="single" w:sz="8" w:space="0" w:color="8C734B" w:themeColor="accent2"/>
-          <w:left w:val="single" w:sz="8" w:space="0" w:color="8C734B" w:themeColor="accent2"/>
-          <w:bottom w:val="single" w:sz="8" w:space="0" w:color="8C734B" w:themeColor="accent2"/>
-          <w:right w:val="single" w:sz="8" w:space="0" w:color="8C734B" w:themeColor="accent2"/>
+          <w:top w:val="single" w:sz="8" w:space="0" w:color="5ECCF3" w:themeColor="accent2"/>
+          <w:left w:val="single" w:sz="8" w:space="0" w:color="5ECCF3" w:themeColor="accent2"/>
+          <w:bottom w:val="single" w:sz="8" w:space="0" w:color="5ECCF3" w:themeColor="accent2"/>
+          <w:right w:val="single" w:sz="8" w:space="0" w:color="5ECCF3" w:themeColor="accent2"/>
         </w:tcBorders>
       </w:tcPr>
     </w:tblStylePr>
@@ -5527,10 +5327,10 @@
       <w:tblPr/>
       <w:tcPr>
         <w:tcBorders>
-          <w:top w:val="single" w:sz="8" w:space="0" w:color="8C734B" w:themeColor="accent2"/>
-          <w:left w:val="single" w:sz="8" w:space="0" w:color="8C734B" w:themeColor="accent2"/>
-          <w:bottom w:val="single" w:sz="8" w:space="0" w:color="8C734B" w:themeColor="accent2"/>
-          <w:right w:val="single" w:sz="8" w:space="0" w:color="8C734B" w:themeColor="accent2"/>
+          <w:top w:val="single" w:sz="8" w:space="0" w:color="5ECCF3" w:themeColor="accent2"/>
+          <w:left w:val="single" w:sz="8" w:space="0" w:color="5ECCF3" w:themeColor="accent2"/>
+          <w:bottom w:val="single" w:sz="8" w:space="0" w:color="5ECCF3" w:themeColor="accent2"/>
+          <w:right w:val="single" w:sz="8" w:space="0" w:color="5ECCF3" w:themeColor="accent2"/>
         </w:tcBorders>
       </w:tcPr>
     </w:tblStylePr>
@@ -5573,7 +5373,7 @@
           <w:insideH w:val="nil"/>
           <w:insideV w:val="nil"/>
         </w:tcBorders>
-        <w:shd w:val="clear" w:color="auto" w:fill="010101" w:themeFill="text1"/>
+        <w:shd w:val="clear" w:color="auto" w:fill="000000" w:themeFill="text1"/>
       </w:tcPr>
     </w:tblStylePr>
     <w:tblStylePr w:type="lastRow">
@@ -5840,7 +5640,7 @@
       <w:rFonts w:ascii="Lato Black" w:hAnsi="Lato Black" w:cs="Arial"/>
       <w:b/>
       <w:bCs/>
-      <w:color w:val="010101" w:themeColor="text1"/>
+      <w:color w:val="000000" w:themeColor="text1"/>
       <w:sz w:val="60"/>
     </w:rPr>
   </w:style>
@@ -5881,7 +5681,7 @@
       <w:b/>
       <w:bCs/>
       <w:noProof/>
-      <w:color w:val="010101" w:themeColor="text1"/>
+      <w:color w:val="000000" w:themeColor="text1"/>
       <w:sz w:val="24"/>
     </w:rPr>
   </w:style>
@@ -5897,7 +5697,7 @@
     </w:pPr>
     <w:rPr>
       <w:rFonts w:eastAsia="AvenirLTStd-Light" w:cs="Arial"/>
-      <w:color w:val="010101" w:themeColor="text1"/>
+      <w:color w:val="000000" w:themeColor="text1"/>
       <w:szCs w:val="22"/>
     </w:rPr>
   </w:style>
@@ -5909,7 +5709,7 @@
     <w:rsid w:val="0028323C"/>
     <w:rPr>
       <w:rFonts w:eastAsia="AvenirLTStd-Light" w:cs="Arial"/>
-      <w:color w:val="010101" w:themeColor="text1"/>
+      <w:color w:val="000000" w:themeColor="text1"/>
     </w:rPr>
   </w:style>
   <w:style w:type="character" w:styleId="LineNumber">
@@ -5994,10 +5794,10 @@
       <w:tblStyleRowBandSize w:val="1"/>
       <w:tblStyleColBandSize w:val="1"/>
       <w:tblBorders>
-        <w:top w:val="single" w:sz="8" w:space="0" w:color="58595B" w:themeColor="accent3"/>
-        <w:left w:val="single" w:sz="8" w:space="0" w:color="58595B" w:themeColor="accent3"/>
-        <w:bottom w:val="single" w:sz="8" w:space="0" w:color="58595B" w:themeColor="accent3"/>
-        <w:right w:val="single" w:sz="8" w:space="0" w:color="58595B" w:themeColor="accent3"/>
+        <w:top w:val="single" w:sz="8" w:space="0" w:color="A7EA52" w:themeColor="accent3"/>
+        <w:left w:val="single" w:sz="8" w:space="0" w:color="A7EA52" w:themeColor="accent3"/>
+        <w:bottom w:val="single" w:sz="8" w:space="0" w:color="A7EA52" w:themeColor="accent3"/>
+        <w:right w:val="single" w:sz="8" w:space="0" w:color="A7EA52" w:themeColor="accent3"/>
       </w:tblBorders>
     </w:tblPr>
     <w:tblStylePr w:type="firstRow">
@@ -6011,7 +5811,7 @@
       </w:rPr>
       <w:tblPr/>
       <w:tcPr>
-        <w:shd w:val="clear" w:color="auto" w:fill="58595B" w:themeFill="accent3"/>
+        <w:shd w:val="clear" w:color="auto" w:fill="A7EA52" w:themeFill="accent3"/>
       </w:tcPr>
     </w:tblStylePr>
     <w:tblStylePr w:type="lastRow">
@@ -6025,10 +5825,10 @@
       <w:tblPr/>
       <w:tcPr>
         <w:tcBorders>
-          <w:top w:val="double" w:sz="6" w:space="0" w:color="58595B" w:themeColor="accent3"/>
-          <w:left w:val="single" w:sz="8" w:space="0" w:color="58595B" w:themeColor="accent3"/>
-          <w:bottom w:val="single" w:sz="8" w:space="0" w:color="58595B" w:themeColor="accent3"/>
-          <w:right w:val="single" w:sz="8" w:space="0" w:color="58595B" w:themeColor="accent3"/>
+          <w:top w:val="double" w:sz="6" w:space="0" w:color="A7EA52" w:themeColor="accent3"/>
+          <w:left w:val="single" w:sz="8" w:space="0" w:color="A7EA52" w:themeColor="accent3"/>
+          <w:bottom w:val="single" w:sz="8" w:space="0" w:color="A7EA52" w:themeColor="accent3"/>
+          <w:right w:val="single" w:sz="8" w:space="0" w:color="A7EA52" w:themeColor="accent3"/>
         </w:tcBorders>
       </w:tcPr>
     </w:tblStylePr>
@@ -6048,10 +5848,10 @@
       <w:tblPr/>
       <w:tcPr>
         <w:tcBorders>
-          <w:top w:val="single" w:sz="8" w:space="0" w:color="58595B" w:themeColor="accent3"/>
-          <w:left w:val="single" w:sz="8" w:space="0" w:color="58595B" w:themeColor="accent3"/>
-          <w:bottom w:val="single" w:sz="8" w:space="0" w:color="58595B" w:themeColor="accent3"/>
-          <w:right w:val="single" w:sz="8" w:space="0" w:color="58595B" w:themeColor="accent3"/>
+          <w:top w:val="single" w:sz="8" w:space="0" w:color="A7EA52" w:themeColor="accent3"/>
+          <w:left w:val="single" w:sz="8" w:space="0" w:color="A7EA52" w:themeColor="accent3"/>
+          <w:bottom w:val="single" w:sz="8" w:space="0" w:color="A7EA52" w:themeColor="accent3"/>
+          <w:right w:val="single" w:sz="8" w:space="0" w:color="A7EA52" w:themeColor="accent3"/>
         </w:tcBorders>
       </w:tcPr>
     </w:tblStylePr>
@@ -6059,10 +5859,10 @@
       <w:tblPr/>
       <w:tcPr>
         <w:tcBorders>
-          <w:top w:val="single" w:sz="8" w:space="0" w:color="58595B" w:themeColor="accent3"/>
-          <w:left w:val="single" w:sz="8" w:space="0" w:color="58595B" w:themeColor="accent3"/>
-          <w:bottom w:val="single" w:sz="8" w:space="0" w:color="58595B" w:themeColor="accent3"/>
-          <w:right w:val="single" w:sz="8" w:space="0" w:color="58595B" w:themeColor="accent3"/>
+          <w:top w:val="single" w:sz="8" w:space="0" w:color="A7EA52" w:themeColor="accent3"/>
+          <w:left w:val="single" w:sz="8" w:space="0" w:color="A7EA52" w:themeColor="accent3"/>
+          <w:bottom w:val="single" w:sz="8" w:space="0" w:color="A7EA52" w:themeColor="accent3"/>
+          <w:right w:val="single" w:sz="8" w:space="0" w:color="A7EA52" w:themeColor="accent3"/>
         </w:tcBorders>
       </w:tcPr>
     </w:tblStylePr>
@@ -6090,7 +5890,7 @@
     </w:pPr>
     <w:rPr>
       <w:b w:val="0"/>
-      <w:color w:val="DE2728" w:themeColor="text2" w:themeTint="E6"/>
+      <w:color w:val="2E3660" w:themeColor="text2" w:themeTint="E6"/>
       <w:sz w:val="20"/>
       <w:szCs w:val="20"/>
       <w:lang w:eastAsia="ja-JP"/>
@@ -6228,7 +6028,7 @@
       <w:jc w:val="center"/>
     </w:pPr>
     <w:rPr>
-      <w:color w:val="010101" w:themeColor="text1"/>
+      <w:color w:val="000000" w:themeColor="text1"/>
       <w:sz w:val="22"/>
     </w:rPr>
   </w:style>
@@ -6406,7 +6206,7 @@
     </w:pPr>
     <w:rPr>
       <w:rFonts w:eastAsiaTheme="minorHAnsi" w:cs="Arial"/>
-      <w:color w:val="010101" w:themeColor="text1"/>
+      <w:color w:val="000000" w:themeColor="text1"/>
     </w:rPr>
   </w:style>
   <w:style w:type="paragraph" w:customStyle="1" w:styleId="TableStyle3Header">
@@ -6438,7 +6238,7 @@
     </w:pPr>
     <w:rPr>
       <w:rFonts w:eastAsiaTheme="minorHAnsi" w:cs="Arial"/>
-      <w:color w:val="010101" w:themeColor="text1"/>
+      <w:color w:val="000000" w:themeColor="text1"/>
     </w:rPr>
   </w:style>
   <w:style w:type="paragraph" w:customStyle="1" w:styleId="TableStyle4Header">
@@ -6469,7 +6269,7 @@
     </w:pPr>
     <w:rPr>
       <w:rFonts w:eastAsiaTheme="minorHAnsi" w:cs="Arial"/>
-      <w:color w:val="010101" w:themeColor="text1"/>
+      <w:color w:val="000000" w:themeColor="text1"/>
     </w:rPr>
   </w:style>
   <w:style w:type="paragraph" w:styleId="Header">
@@ -6536,7 +6336,7 @@
     <w:rsid w:val="00460121"/>
     <w:rPr>
       <w:rFonts w:ascii="Aptos" w:hAnsi="Aptos"/>
-      <w:color w:val="010101" w:themeColor="text1"/>
+      <w:color w:val="000000" w:themeColor="text1"/>
       <w:sz w:val="20"/>
     </w:rPr>
   </w:style>
@@ -6558,7 +6358,7 @@
     </w:pPr>
     <w:rPr>
       <w:rFonts w:ascii="Aptos" w:hAnsi="Aptos"/>
-      <w:color w:val="010101" w:themeColor="text1"/>
+      <w:color w:val="000000" w:themeColor="text1"/>
       <w:sz w:val="20"/>
       <w:szCs w:val="22"/>
     </w:rPr>
@@ -6572,7 +6372,7 @@
     <w:rPr>
       <w:rFonts w:asciiTheme="majorHAnsi" w:eastAsiaTheme="majorEastAsia" w:hAnsiTheme="majorHAnsi" w:cs="Arial"/>
       <w:b/>
-      <w:color w:val="DE2728" w:themeColor="text2" w:themeTint="E6"/>
+      <w:color w:val="2E3660" w:themeColor="text2" w:themeTint="E6"/>
       <w:sz w:val="20"/>
       <w:szCs w:val="20"/>
       <w:lang w:eastAsia="ja-JP"/>
@@ -6798,7 +6598,7 @@
     <w:unhideWhenUsed/>
     <w:rsid w:val="008346C5"/>
     <w:rPr>
-      <w:color w:val="8D0E11" w:themeColor="followedHyperlink"/>
+      <w:color w:val="59A8D1" w:themeColor="followedHyperlink"/>
       <w:u w:val="single"/>
     </w:rPr>
   </w:style>
@@ -6859,7 +6659,7 @@
     <w:rPr>
       <w:rFonts w:ascii="Franklin Gothic Demi Cond" w:hAnsi="Franklin Gothic Demi Cond"/>
       <w:b w:val="0"/>
-      <w:color w:val="010101" w:themeColor="text1"/>
+      <w:color w:val="000000" w:themeColor="text1"/>
       <w:sz w:val="28"/>
     </w:rPr>
   </w:style>
@@ -7430,42 +7230,42 @@
 <file path=word/theme/theme1.xml><?xml version="1.0" encoding="utf-8"?>
 <a:theme xmlns:a="http://schemas.openxmlformats.org/drawingml/2006/main" name="XD_PPT_Template_ForConsideration">
   <a:themeElements>
-    <a:clrScheme name="Perficient">
+    <a:clrScheme name="Slipstream">
       <a:dk1>
-        <a:srgbClr val="010101"/>
+        <a:sysClr val="windowText" lastClr="000000"/>
       </a:dk1>
       <a:lt1>
-        <a:srgbClr val="FFFFFF"/>
+        <a:sysClr val="window" lastClr="FFFFFF"/>
       </a:lt1>
       <a:dk2>
-        <a:srgbClr val="CC1F20"/>
+        <a:srgbClr val="212745"/>
       </a:dk2>
       <a:lt2>
-        <a:srgbClr val="B79967"/>
+        <a:srgbClr val="B4DCFA"/>
       </a:lt2>
       <a:accent1>
-        <a:srgbClr val="8D0E11"/>
+        <a:srgbClr val="4E67C8"/>
       </a:accent1>
       <a:accent2>
-        <a:srgbClr val="8C734B"/>
+        <a:srgbClr val="5ECCF3"/>
       </a:accent2>
       <a:accent3>
-        <a:srgbClr val="58595B"/>
+        <a:srgbClr val="A7EA52"/>
       </a:accent3>
       <a:accent4>
-        <a:srgbClr val="E8E8E8"/>
+        <a:srgbClr val="5DCEAF"/>
       </a:accent4>
       <a:accent5>
-        <a:srgbClr val="3C5D6F"/>
+        <a:srgbClr val="FF8021"/>
       </a:accent5>
       <a:accent6>
-        <a:srgbClr val="81A7BB"/>
+        <a:srgbClr val="F14124"/>
       </a:accent6>
       <a:hlink>
-        <a:srgbClr val="CC1F20"/>
+        <a:srgbClr val="56C7AA"/>
       </a:hlink>
       <a:folHlink>
-        <a:srgbClr val="8D0E11"/>
+        <a:srgbClr val="59A8D1"/>
       </a:folHlink>
     </a:clrScheme>
     <a:fontScheme name="Custom 1">
@@ -7976,7 +7776,22 @@
 </file>
 
 <file path=customXml/itemProps1.xml><?xml version="1.0" encoding="utf-8"?>
-<ds:datastoreItem xmlns:ds="http://schemas.openxmlformats.org/officeDocument/2006/customXml" ds:itemID="{38149DFC-87F7-41B0-9D6B-469202EF58B5}"/>
+<ds:datastoreItem xmlns:ds="http://schemas.openxmlformats.org/officeDocument/2006/customXml" ds:itemID="{38149DFC-87F7-41B0-9D6B-469202EF58B5}">
+  <ds:schemaRefs>
+    <ds:schemaRef ds:uri="http://schemas.microsoft.com/office/2006/metadata/contentType"/>
+    <ds:schemaRef ds:uri="http://schemas.microsoft.com/office/2006/metadata/properties/metaAttributes"/>
+    <ds:schemaRef ds:uri="http://www.w3.org/2001/XMLSchema"/>
+    <ds:schemaRef ds:uri="http://schemas.microsoft.com/office/2006/metadata/properties"/>
+    <ds:schemaRef ds:uri="ed48454b-45cc-45b1-856a-7b766b483745"/>
+    <ds:schemaRef ds:uri="7ed3c4da-b135-42a5-aaf8-d0ebc05f566e"/>
+    <ds:schemaRef ds:uri="http://schemas.microsoft.com/office/2006/documentManagement/types"/>
+    <ds:schemaRef ds:uri="http://schemas.microsoft.com/office/infopath/2007/PartnerControls"/>
+    <ds:schemaRef ds:uri="http://schemas.openxmlformats.org/package/2006/metadata/core-properties"/>
+    <ds:schemaRef ds:uri="http://purl.org/dc/elements/1.1/"/>
+    <ds:schemaRef ds:uri="http://purl.org/dc/terms/"/>
+    <ds:schemaRef ds:uri="http://schemas.microsoft.com/internal/obd"/>
+  </ds:schemaRefs>
+</ds:datastoreItem>
 </file>
 
 <file path=customXml/itemProps2.xml><?xml version="1.0" encoding="utf-8"?>
@@ -7992,9 +7807,8 @@
   <ds:schemaRefs>
     <ds:schemaRef ds:uri="http://schemas.microsoft.com/office/2006/metadata/properties"/>
     <ds:schemaRef ds:uri="http://schemas.microsoft.com/office/infopath/2007/PartnerControls"/>
-    <ds:schemaRef ds:uri="b2e3c997-3698-4d60-a5df-0f3c0437e4b5"/>
-    <ds:schemaRef ds:uri="1e64e528-ba93-4d5f-b6b0-000f8c7b81c4"/>
-    <ds:schemaRef ds:uri="17c5e8b1-03fe-43e8-b3fd-8090910a5cb1"/>
+    <ds:schemaRef ds:uri="ed48454b-45cc-45b1-856a-7b766b483745"/>
+    <ds:schemaRef ds:uri="7ed3c4da-b135-42a5-aaf8-d0ebc05f566e"/>
   </ds:schemaRefs>
 </ds:datastoreItem>
 </file>

</xml_diff>